<commit_message>
Integrate finite-force results into academic reports and public evidence
</commit_message>
<xml_diff>
--- a/university/GEN5_FINAL_YEAR_REPORT.docx
+++ b/university/GEN5_FINAL_YEAR_REPORT.docx
@@ -9323,7 +9323,7 @@
     </w:p>
     <w:bookmarkEnd w:id="151"/>
     <w:bookmarkEnd w:id="152"/>
-    <w:bookmarkStart w:id="202" w:name="separate-gen6-research-studies"/>
+    <w:bookmarkStart w:id="207" w:name="separate-gen6-research-studies"/>
     <w:p>
       <w:pPr>
         <w:pStyle w:val="Heading1"/>
@@ -10679,8 +10679,122 @@
       </w:r>
     </w:p>
     <w:bookmarkEnd w:id="201"/>
-    <w:bookmarkEnd w:id="202"/>
-    <w:bookmarkStart w:id="207" w:name="bibliography"/>
+    <w:bookmarkStart w:id="206" w:name="finite-duration-host-targeting"/>
+    <w:p>
+      <w:pPr>
+        <w:pStyle w:val="Heading2"/>
+      </w:pPr>
+      <w:r>
+        <w:t>C.6 Finite-duration host targeting</w:t>
+      </w:r>
+    </w:p>
+    <w:p>
+      <w:pPr>
+        <w:pStyle w:val="FirstParagraph"/>
+      </w:pPr>
+      <w:r>
+        <w:t xml:space="preserve">The separately versioned</w:t>
+      </w:r>
+      <w:r>
+        <w:t xml:space="preserve"> </w:t>
+      </w:r>
+      <w:hyperlink r:id="rId202">
+        <w:r>
+          <w:rPr>
+            <w:rStyle w:val="Hyperlink"/>
+          </w:rPr>
+          <w:t xml:space="preserve">FBR-01 finite-force report</w:t>
+        </w:r>
+      </w:hyperlink>
+      <w:r>
+        <w:t xml:space="preserve"> </w:t>
+      </w:r>
+      <w:r>
+        <w:t xml:space="preserve">targets actual finite-duration resultant-force windows with integrated mass consumption. Eighteen solutions vary the two-window fraction, numerical step and fuel reserve; 46 native Orekit runs include nominal replays, refinements and deterministic force/release/initial-state probes. Preparation from −900 s, 20 s post-release guards and recovery to 4200 s are counted. All payloads retain the common 90000 s assessment epoch. The inputs remain imposed release velocities and a fixed-axis J2 point-mass model.</w:t>
+      </w:r>
+    </w:p>
+    <w:p>
+      <w:pPr>
+        <w:pStyle w:val="BodyText"/>
+      </w:pPr>
+      <w:r>
+        <w:t xml:space="preserve">At the 35%/35% policy, four-release spring/VOLLEY inputs require 13.36/6.50 N peak and 6.056/1.895 kg fuel. Twelve-release inputs require 33.83/18.00 N and 23.122/6.123 kg. The twelve-spring 20 kg reserve is exhausted at 3509.06 s; subsequent formal trajectory is diagnostic only. With a common 30 kg reserve and 100 N limit, both twelve-release controls reach the constructed full-state targets. The 17.460 kg propellant saving remains smaller than the 42 kg device-proxy penalty.</w:t>
+      </w:r>
+    </w:p>
+    <w:p>
+      <w:pPr>
+        <w:pStyle w:val="CaptionedFigure"/>
+      </w:pPr>
+      <w:r>
+        <w:drawing>
+          <wp:inline>
+            <wp:extent cx="5389118" cy="3853385"/>
+            <wp:effectExtent b="0" l="0" r="0" t="0"/>
+            <wp:docPr descr="Retargeted finite-force schedules under common mission targets. Each point is a separate solution; limits and hardware resources are surrogate assumptions." title="" id="204" name="Picture"/>
+            <a:graphic>
+              <a:graphicData uri="http://schemas.openxmlformats.org/drawingml/2006/picture">
+                <pic:pic>
+                  <pic:nvPicPr>
+                    <pic:cNvPr descr="../validation/finite_burn_review/figures/force_fuel_trade.png" id="205" name="Picture"/>
+                    <pic:cNvPicPr>
+                      <a:picLocks noChangeArrowheads="1" noChangeAspect="1"/>
+                    </pic:cNvPicPr>
+                  </pic:nvPicPr>
+                  <pic:blipFill>
+                    <a:blip r:embed="rId203"/>
+                    <a:stretch>
+                      <a:fillRect/>
+                    </a:stretch>
+                  </pic:blipFill>
+                  <pic:spPr bwMode="auto">
+                    <a:xfrm>
+                      <a:off x="0" y="0"/>
+                      <a:ext cx="5389118" cy="3853385"/>
+                    </a:xfrm>
+                    <a:prstGeom prst="rect">
+                      <a:avLst/>
+                    </a:prstGeom>
+                    <a:noFill/>
+                    <a:ln w="9525">
+                      <a:noFill/>
+                      <a:headEnd/>
+                      <a:tailEnd/>
+                    </a:ln>
+                  </pic:spPr>
+                </pic:pic>
+              </a:graphicData>
+            </a:graphic>
+          </wp:inline>
+        </w:drawing>
+      </w:r>
+    </w:p>
+    <w:p>
+      <w:pPr>
+        <w:pStyle w:val="Caption"/>
+      </w:pPr>
+      <w:r>
+        <w:t xml:space="preserve">Figure </w:t>
+      </w:r>
+      <w:fldSimple w:instr="SEQ Figure \* ARABIC">
+        <w:r>
+          <w:t>29</w:t>
+        </w:r>
+      </w:fldSimple>
+      <w:r>
+        <w:t>: Retargeted finite-force schedules under common mission targets. Each point is a separate solution; limits and hardware resources are surrogate assumptions.</w:t>
+      </w:r>
+    </w:p>
+    <w:p>
+      <w:pPr>
+        <w:pStyle w:val="BodyText"/>
+      </w:pPr>
+      <w:r>
+        <w:t xml:space="preserve">Native nominal terminal differences stay below 23 µm and eight numerical refinement differences below 13 µm. These verify numerical consistency, not real delivery accuracy. A single fixed-thruster interpretation requires nearly 9°/s mean direction reversal in some 20 s gaps, with no settling allowance. Opposed thrust allocation might avoid whole-host reversal, but its plumbing, mass, plume geometry and attitude requirements are undefined. Host compatibility, physical near-field safety, navigation feedback, installed hardware and the motor/circuit rating remain open; no operational service is established.</w:t>
+      </w:r>
+    </w:p>
+    <w:bookmarkEnd w:id="206"/>
+    <w:bookmarkEnd w:id="207"/>
+    <w:bookmarkStart w:id="212" w:name="bibliography"/>
     <w:p>
       <w:pPr>
         <w:pStyle w:val="Heading1"/>
@@ -10741,7 +10855,7 @@
       <w:r>
         <w:t xml:space="preserve"> </w:t>
       </w:r>
-      <w:hyperlink r:id="rId203">
+      <w:hyperlink r:id="rId208">
         <w:r>
           <w:rPr>
             <w:rStyle w:val="Hyperlink"/>
@@ -10892,7 +11006,7 @@
       <w:r>
         <w:t xml:space="preserve"> </w:t>
       </w:r>
-      <w:hyperlink r:id="rId204">
+      <w:hyperlink r:id="rId209">
         <w:r>
           <w:rPr>
             <w:rStyle w:val="Hyperlink"/>
@@ -10956,7 +11070,7 @@
       <w:r>
         <w:t xml:space="preserve"> </w:t>
       </w:r>
-      <w:hyperlink r:id="rId205">
+      <w:hyperlink r:id="rId210">
         <w:r>
           <w:rPr>
             <w:rStyle w:val="Hyperlink"/>
@@ -11156,7 +11270,7 @@
       <w:r>
         <w:t xml:space="preserve"> </w:t>
       </w:r>
-      <w:hyperlink r:id="rId206">
+      <w:hyperlink r:id="rId211">
         <w:r>
           <w:rPr>
             <w:rStyle w:val="Hyperlink"/>
@@ -11168,7 +11282,7 @@
         <w:t xml:space="preserve">. Bibliographic context; not an experimental validation of VOLLEY.</w:t>
       </w:r>
     </w:p>
-    <w:bookmarkEnd w:id="207"/>
+    <w:bookmarkEnd w:id="212"/>
     <w:sectPr>
       <w:footerReference r:id="rId9" w:type="default"/>
       <w:pgSz w:h="16838" w:w="11906"/>

</xml_diff>

<commit_message>
Reconcile feeder evidence with academic reports and public engineering pages
</commit_message>
<xml_diff>
--- a/university/GEN5_FINAL_YEAR_REPORT.docx
+++ b/university/GEN5_FINAL_YEAR_REPORT.docx
@@ -9323,7 +9323,7 @@
     </w:p>
     <w:bookmarkEnd w:id="151"/>
     <w:bookmarkEnd w:id="152"/>
-    <w:bookmarkStart w:id="207" w:name="separate-gen6-research-studies"/>
+    <w:bookmarkStart w:id="212" w:name="separate-gen6-research-studies"/>
     <w:p>
       <w:pPr>
         <w:pStyle w:val="Heading1"/>
@@ -10793,8 +10793,195 @@
       </w:r>
     </w:p>
     <w:bookmarkEnd w:id="206"/>
-    <w:bookmarkEnd w:id="207"/>
-    <w:bookmarkStart w:id="212" w:name="bibliography"/>
+    <w:bookmarkStart w:id="211" w:name="X6b6553b04d77f522ccb9519af74536ecc2d3dd1"/>
+    <w:p>
+      <w:pPr>
+        <w:pStyle w:val="Heading2"/>
+      </w:pPr>
+      <w:r>
+        <w:t>C.7 Feeder actuation and revised custody geometry</w:t>
+      </w:r>
+    </w:p>
+    <w:p>
+      <w:pPr>
+        <w:pStyle w:val="FirstParagraph"/>
+      </w:pPr>
+      <w:r>
+        <w:t xml:space="preserve">The separate</w:t>
+      </w:r>
+      <w:r>
+        <w:t xml:space="preserve"> </w:t>
+      </w:r>
+      <w:hyperlink r:id="rId207">
+        <w:r>
+          <w:rPr>
+            <w:rStyle w:val="Hyperlink"/>
+          </w:rPr>
+          <w:t xml:space="preserve">FM-02 engineering review</w:t>
+        </w:r>
+      </w:hyperlink>
+      <w:r>
+        <w:t xml:space="preserve"> </w:t>
+      </w:r>
+      <w:r>
+        <w:t xml:space="preserve">replaces the tall receiving latch with a 12 mm underfloor entry frame, two positive endpoint crosspins and a physically represented sled. Twenty-eight native FreeCAD/STEP poses and 26 continuous prescribed rigid-translation phases have no represented positive-volume penetration. The storage crossbolt and each receiving pin obstruct the tested adverse motions. Axial pin capture, actual release actuators, loaded contacts and complete deployment/reset remain unimplemented; no hardware containment or manufacturing release follows.</w:t>
+      </w:r>
+    </w:p>
+    <w:p>
+      <w:pPr>
+        <w:pStyle w:val="CaptionedFigure"/>
+      </w:pPr>
+      <w:r>
+        <w:drawing>
+          <wp:inline>
+            <wp:extent cx="5389118" cy="3406499"/>
+            <wp:effectExtent b="0" l="0" r="0" t="0"/>
+            <wp:docPr descr="FM-02 captive handling sequence from actual STEP exchanges. The payload remains retained during the illustrated 80 mm sled translation and return; no launch is represented." title="" id="209" name="Picture"/>
+            <a:graphic>
+              <a:graphicData uri="http://schemas.openxmlformats.org/drawingml/2006/picture">
+                <pic:pic>
+                  <pic:nvPicPr>
+                    <pic:cNvPr descr="../validation/feeder_actuation_review/figures/step_sequence.png" id="210" name="Picture"/>
+                    <pic:cNvPicPr>
+                      <a:picLocks noChangeArrowheads="1" noChangeAspect="1"/>
+                    </pic:cNvPicPr>
+                  </pic:nvPicPr>
+                  <pic:blipFill>
+                    <a:blip r:embed="rId208"/>
+                    <a:stretch>
+                      <a:fillRect/>
+                    </a:stretch>
+                  </pic:blipFill>
+                  <pic:spPr bwMode="auto">
+                    <a:xfrm>
+                      <a:off x="0" y="0"/>
+                      <a:ext cx="5389118" cy="3406499"/>
+                    </a:xfrm>
+                    <a:prstGeom prst="rect">
+                      <a:avLst/>
+                    </a:prstGeom>
+                    <a:noFill/>
+                    <a:ln w="9525">
+                      <a:noFill/>
+                      <a:headEnd/>
+                      <a:tailEnd/>
+                    </a:ln>
+                  </pic:spPr>
+                </pic:pic>
+              </a:graphicData>
+            </a:graphic>
+          </wp:inline>
+        </w:drawing>
+      </w:r>
+    </w:p>
+    <w:p>
+      <w:pPr>
+        <w:pStyle w:val="Caption"/>
+      </w:pPr>
+      <w:r>
+        <w:t xml:space="preserve">Figure </w:t>
+      </w:r>
+      <w:fldSimple w:instr="SEQ Figure \* ARABIC">
+        <w:r>
+          <w:t>30</w:t>
+        </w:r>
+      </w:fldSimple>
+      <w:r>
+        <w:t>: FM-02 captive handling sequence from actual STEP exchanges. The payload remains retained during the illustrated 80 mm sled translation and return; no launch is represented.</w:t>
+      </w:r>
+    </w:p>
+    <w:p>
+      <w:pPr>
+        <w:pStyle w:val="BodyText"/>
+      </w:pPr>
+      <w:r>
+        <w:t xml:space="preserve">The integrated ball-screw candidate is a separate ambient component screen and is not installed in this CAD. A quintic rest-to-rest law, moving load, drag, rotational inertia and component limits are checked in 972 scenarios. Polynomial extrema and exact piecewise integrals reproduce every decision; at 801 samples the maximum relative torque and input-energy-proxy discrepancies are</w:t>
+      </w:r>
+      <w:r>
+        <w:t xml:space="preserve"> </w:t>
+      </w:r>
+      <m:oMath>
+        <m:r>
+          <m:t>8.58</m:t>
+        </m:r>
+        <m:r>
+          <m:rPr>
+            <m:sty m:val="p"/>
+          </m:rPr>
+          <m:t>×</m:t>
+        </m:r>
+        <m:sSup>
+          <m:e>
+            <m:r>
+              <m:t>10</m:t>
+            </m:r>
+          </m:e>
+          <m:sup>
+            <m:r>
+              <m:rPr>
+                <m:sty m:val="p"/>
+              </m:rPr>
+              <m:t>−</m:t>
+            </m:r>
+            <m:r>
+              <m:t>8</m:t>
+            </m:r>
+          </m:sup>
+        </m:sSup>
+      </m:oMath>
+      <w:r>
+        <w:t xml:space="preserve"> </w:t>
+      </w:r>
+      <w:r>
+        <w:t xml:space="preserve">and</w:t>
+      </w:r>
+      <w:r>
+        <w:t xml:space="preserve"> </w:t>
+      </w:r>
+      <m:oMath>
+        <m:r>
+          <m:t>1.08</m:t>
+        </m:r>
+        <m:r>
+          <m:rPr>
+            <m:sty m:val="p"/>
+          </m:rPr>
+          <m:t>×</m:t>
+        </m:r>
+        <m:sSup>
+          <m:e>
+            <m:r>
+              <m:t>10</m:t>
+            </m:r>
+          </m:e>
+          <m:sup>
+            <m:r>
+              <m:rPr>
+                <m:sty m:val="p"/>
+              </m:rPr>
+              <m:t>−</m:t>
+            </m:r>
+            <m:r>
+              <m:t>6</m:t>
+            </m:r>
+          </m:sup>
+        </m:sSup>
+      </m:oMath>
+      <w:r>
+        <w:t xml:space="preserve">. These are numerical model errors, not physical uncertainties. The sampled 10, 15 and 20 s cases meet the declared ambient screen; 5 s cases fail.</w:t>
+      </w:r>
+    </w:p>
+    <w:p>
+      <w:pPr>
+        <w:pStyle w:val="BodyText"/>
+      </w:pPr>
+      <w:r>
+        <w:t xml:space="preserve">The study retains 115 of 324 nonpositive fit residuals, 12 of 54 winding-temperature failures, 96 no-stop brake sensitivities and 72 finite runouts above the proposed 24 mm allowance. Actual component temperature domains differ, and the two-node thermal model is uncorrelated. A slow 103.0 s handling assumption does not fit eleven later twelve-release coasts of 92.182 s; a faster 74.5 s assumption fits, without actuator, attitude, indexing or full campaign validation. These findings define remaining engineering requirements. All seven feeder alternatives remain unselected; Gen5’s achieved computational result is unchanged.</w:t>
+      </w:r>
+    </w:p>
+    <w:bookmarkEnd w:id="211"/>
+    <w:bookmarkEnd w:id="212"/>
+    <w:bookmarkStart w:id="217" w:name="bibliography"/>
     <w:p>
       <w:pPr>
         <w:pStyle w:val="Heading1"/>
@@ -10855,7 +11042,7 @@
       <w:r>
         <w:t xml:space="preserve"> </w:t>
       </w:r>
-      <w:hyperlink r:id="rId208">
+      <w:hyperlink r:id="rId213">
         <w:r>
           <w:rPr>
             <w:rStyle w:val="Hyperlink"/>
@@ -11006,7 +11193,7 @@
       <w:r>
         <w:t xml:space="preserve"> </w:t>
       </w:r>
-      <w:hyperlink r:id="rId209">
+      <w:hyperlink r:id="rId214">
         <w:r>
           <w:rPr>
             <w:rStyle w:val="Hyperlink"/>
@@ -11070,7 +11257,7 @@
       <w:r>
         <w:t xml:space="preserve"> </w:t>
       </w:r>
-      <w:hyperlink r:id="rId210">
+      <w:hyperlink r:id="rId215">
         <w:r>
           <w:rPr>
             <w:rStyle w:val="Hyperlink"/>
@@ -11270,7 +11457,7 @@
       <w:r>
         <w:t xml:space="preserve"> </w:t>
       </w:r>
-      <w:hyperlink r:id="rId211">
+      <w:hyperlink r:id="rId216">
         <w:r>
           <w:rPr>
             <w:rStyle w:val="Hyperlink"/>
@@ -11282,7 +11469,7 @@
         <w:t xml:space="preserve">. Bibliographic context; not an experimental validation of VOLLEY.</w:t>
       </w:r>
     </w:p>
-    <w:bookmarkEnd w:id="212"/>
+    <w:bookmarkEnd w:id="217"/>
     <w:sectPr>
       <w:footerReference r:id="rId9" w:type="default"/>
       <w:pgSz w:h="16838" w:w="11906"/>

</xml_diff>

<commit_message>
Synchronize current feeder evidence across academic and public review surfaces
</commit_message>
<xml_diff>
--- a/university/GEN5_FINAL_YEAR_REPORT.docx
+++ b/university/GEN5_FINAL_YEAR_REPORT.docx
@@ -174,7 +174,7 @@
         <w:jc w:val="center"/>
       </w:pPr>
       <w:r>
-        <w:t>First similarity-review issue · 20 October 2026</w:t>
+        <w:t>First similarity-review issue · 21 October 2026</w:t>
       </w:r>
     </w:p>
     <w:p>
@@ -649,7 +649,7 @@
         <w:pStyle w:val="BodyText"/>
       </w:pPr>
       <w:r>
-        <w:t xml:space="preserve">This issue contains the evaluated Gen5 study and separately identified Gen6 research through 19 October 2026. It is issued on 20 October for first similarity review; institutional approval and the similarity result are not asserted.</w:t>
+        <w:t xml:space="preserve">This issue contains the evaluated Gen5 study and separately identified Gen6 research through 21 October 2026. It is issued for first similarity review; institutional approval and the similarity result are not asserted. Gen6 research does not alter the evaluated Gen5 configuration.</w:t>
       </w:r>
     </w:p>
     <w:p>
@@ -9323,7 +9323,7 @@
     </w:p>
     <w:bookmarkEnd w:id="151"/>
     <w:bookmarkEnd w:id="152"/>
-    <w:bookmarkStart w:id="212" w:name="separate-gen6-research-studies"/>
+    <w:bookmarkStart w:id="223" w:name="separate-gen6-research-studies"/>
     <w:p>
       <w:pPr>
         <w:pStyle w:val="Heading1"/>
@@ -10980,8 +10980,288 @@
       </w:r>
     </w:p>
     <w:bookmarkEnd w:id="211"/>
-    <w:bookmarkEnd w:id="212"/>
-    <w:bookmarkStart w:id="217" w:name="bibliography"/>
+    <w:bookmarkStart w:id="222" w:name="X1b681701ec9e6e2d377679d56180e9ea2366932"/>
+    <w:p>
+      <w:pPr>
+        <w:pStyle w:val="Heading2"/>
+      </w:pPr>
+      <w:r>
+        <w:t>C.8 Feeder geometry, component stiffness and contact limitations: 21 October 2026</w:t>
+      </w:r>
+    </w:p>
+    <w:p>
+      <w:pPr>
+        <w:pStyle w:val="FirstParagraph"/>
+      </w:pPr>
+      <w:r>
+        <w:t xml:space="preserve">The separate</w:t>
+      </w:r>
+      <w:r>
+        <w:t xml:space="preserve"> </w:t>
+      </w:r>
+      <w:hyperlink r:id="rId212">
+        <w:r>
+          <w:rPr>
+            <w:rStyle w:val="Hyperlink"/>
+          </w:rPr>
+          <w:t xml:space="preserve">FM06-R1 record</w:t>
+        </w:r>
+      </w:hyperlink>
+      <w:r>
+        <w:t xml:space="preserve"> </w:t>
+      </w:r>
+      <w:r>
+        <w:t xml:space="preserve">introduces integral support tines, a 12 mm front-restraint stroke and longer receiver guides. Thirty native FreeCAD/STEP poses, seventy individual part exchanges and 28 continuous prescribed rigid-translation checks retain no represented nominal positive-volume interference. An edge-only backstop/rail junction, missed by solid-validity checks, is corrected and all seventy component contact surfaces pass a closed, consistently wound mesh audit. These are reference geometries, not manufacturing drawings or physical qualification.</w:t>
+      </w:r>
+    </w:p>
+    <w:p>
+      <w:pPr>
+        <w:pStyle w:val="CaptionedFigure"/>
+      </w:pPr>
+      <w:r>
+        <w:drawing>
+          <wp:inline>
+            <wp:extent cx="5169154" cy="3692252"/>
+            <wp:effectExtent b="0" l="0" r="0" t="0"/>
+            <wp:docPr descr="FM06-R1 cassette-to-sled transfer state, rendered from native FreeCAD geometry using Blender Workbench. The payload remains retained; installed actuation, rail-end interfaces and free separation are unresolved." title="" id="214" name="Picture"/>
+            <a:graphic>
+              <a:graphicData uri="http://schemas.openxmlformats.org/drawingml/2006/picture">
+                <pic:pic>
+                  <pic:nvPicPr>
+                    <pic:cNvPr descr="../validation/feeder_integrity_review/figures/FM06_Technical_transfer.png" id="215" name="Picture"/>
+                    <pic:cNvPicPr>
+                      <a:picLocks noChangeArrowheads="1" noChangeAspect="1"/>
+                    </pic:cNvPicPr>
+                  </pic:nvPicPr>
+                  <pic:blipFill>
+                    <a:blip r:embed="rId213"/>
+                    <a:stretch>
+                      <a:fillRect/>
+                    </a:stretch>
+                  </pic:blipFill>
+                  <pic:spPr bwMode="auto">
+                    <a:xfrm>
+                      <a:off x="0" y="0"/>
+                      <a:ext cx="5169154" cy="3692252"/>
+                    </a:xfrm>
+                    <a:prstGeom prst="rect">
+                      <a:avLst/>
+                    </a:prstGeom>
+                    <a:noFill/>
+                    <a:ln w="9525">
+                      <a:noFill/>
+                      <a:headEnd/>
+                      <a:tailEnd/>
+                    </a:ln>
+                  </pic:spPr>
+                </pic:pic>
+              </a:graphicData>
+            </a:graphic>
+          </wp:inline>
+        </w:drawing>
+      </w:r>
+    </w:p>
+    <w:p>
+      <w:pPr>
+        <w:pStyle w:val="Caption"/>
+      </w:pPr>
+      <w:r>
+        <w:t xml:space="preserve">Figure </w:t>
+      </w:r>
+      <w:fldSimple w:instr="SEQ Figure \* ARABIC">
+        <w:r>
+          <w:t>31</w:t>
+        </w:r>
+      </w:fldSimple>
+      <w:r>
+        <w:t>: FM06-R1 cassette-to-sled transfer state, rendered from native FreeCAD geometry using Blender Workbench. The payload remains retained; installed actuation, rail-end interfaces and free separation are unresolved.</w:t>
+      </w:r>
+    </w:p>
+    <w:p>
+      <w:pPr>
+        <w:pStyle w:val="BodyText"/>
+      </w:pPr>
+      <w:r>
+        <w:t xml:space="preserve">A revision audit found that the earlier receiver-fixture results use a different crossbar arrangement. Twelve new native FLR03 cases therefore analyze the actual FM06-R1 solid, alongside forty historical FLR01 cases. Under 1,000 N reference loads and assumed steel stiffness, the 3U one-dog mean loaded-face displacement changes from 1.8829 mm for FM02 to 0.05998 mm for current FM06. The historical FM03 result is 0.05811 mm and is not substituted for the current revision. The largest final FLR03 mesh-to-mesh compliance change is 0.200%. Both pin bores are fully clamped, so the reduction applies to this component fixture and does not bound assembled stiffness. Reaction force and moment balance are checked; no selected alloy allowable or assembled pin-contact acceptance follows.</w:t>
+      </w:r>
+    </w:p>
+    <w:p>
+      <w:pPr>
+        <w:pStyle w:val="BodyText"/>
+      </w:pPr>
+      <w:r>
+        <w:t xml:space="preserve">Four native unit-load tine meshes yield 0.0101446 mm/N mean end compliance at the finest 53,650-element mesh, with a final 0.0334% change. Forty linear-scaled load sensitivities retain large-deflection and gap failures. At 6 kg and 1 g, an assumed equal load split gives approximately 0.298 mm displacement per tine against a nominal 0.6 mm slot gap; one-tine loading nearly consumes that gap before root/frame flexibility and tolerances. The clamped isolated tine is not a qualification model.</w:t>
+      </w:r>
+    </w:p>
+    <w:p>
+      <w:pPr>
+        <w:pStyle w:val="CaptionedFigure"/>
+      </w:pPr>
+      <w:r>
+        <w:drawing>
+          <wp:inline>
+            <wp:extent cx="5279136" cy="2227135"/>
+            <wp:effectExtent b="0" l="0" r="0" t="0"/>
+            <wp:docPr descr="Native component-fixture compliance comparison. The logarithmic axis covers historical and current receiver revisions under identical reference loads; the supports are idealized clamped bores." title="" id="217" name="Picture"/>
+            <a:graphic>
+              <a:graphicData uri="http://schemas.openxmlformats.org/drawingml/2006/picture">
+                <pic:pic>
+                  <pic:nvPicPr>
+                    <pic:cNvPr descr="../validation/feeder_integrity_review/figures/component_compliance.png" id="218" name="Picture"/>
+                    <pic:cNvPicPr>
+                      <a:picLocks noChangeArrowheads="1" noChangeAspect="1"/>
+                    </pic:cNvPicPr>
+                  </pic:nvPicPr>
+                  <pic:blipFill>
+                    <a:blip r:embed="rId216"/>
+                    <a:stretch>
+                      <a:fillRect/>
+                    </a:stretch>
+                  </pic:blipFill>
+                  <pic:spPr bwMode="auto">
+                    <a:xfrm>
+                      <a:off x="0" y="0"/>
+                      <a:ext cx="5279136" cy="2227135"/>
+                    </a:xfrm>
+                    <a:prstGeom prst="rect">
+                      <a:avLst/>
+                    </a:prstGeom>
+                    <a:noFill/>
+                    <a:ln w="9525">
+                      <a:noFill/>
+                      <a:headEnd/>
+                      <a:tailEnd/>
+                    </a:ln>
+                  </pic:spPr>
+                </pic:pic>
+              </a:graphicData>
+            </a:graphic>
+          </wp:inline>
+        </w:drawing>
+      </w:r>
+    </w:p>
+    <w:p>
+      <w:pPr>
+        <w:pStyle w:val="Caption"/>
+      </w:pPr>
+      <w:r>
+        <w:t xml:space="preserve">Figure </w:t>
+      </w:r>
+      <w:fldSimple w:instr="SEQ Figure \* ARABIC">
+        <w:r>
+          <w:t>32</w:t>
+        </w:r>
+      </w:fldSimple>
+      <w:r>
+        <w:t>: Native component-fixture compliance comparison. The logarithmic axis covers historical and current receiver revisions under identical reference loads; the supports are idealized clamped bores.</w:t>
+      </w:r>
+    </w:p>
+    <w:p>
+      <w:pPr>
+        <w:pStyle w:val="BodyText"/>
+      </w:pPr>
+      <w:r>
+        <w:t xml:space="preserve">Longer guides reduce the bounded rigid rocking excursion, but the tighter fit creates a separate manufacturing problem: 1,117 of 1,215 deterministic adverse width/alignment/thermal/deflection combinations have nonpositive residual width. The count is not a statistical hardware failure rate.</w:t>
+      </w:r>
+    </w:p>
+    <w:p>
+      <w:pPr>
+        <w:pStyle w:val="BodyText"/>
+      </w:pPr>
+      <w:r>
+        <w:t xml:space="preserve">The twelve-case FCE08 Project Chrono campaign evaluates CAD-derived rigid contact, step/iteration sensitivity, assumed friction, a gravity sensitivity and two injected faults. Nominal sequences complete, but force peaks and final poses remain numerically sensitive. Independent exact-solid spot checks find payload/fork intersections in actual simulated poses despite small reported triangle-contact distances.</w:t>
+      </w:r>
+      <w:r>
+        <w:t xml:space="preserve"> </w:t>
+      </w:r>
+      <w:r>
+        <w:rPr>
+          <w:b/>
+          <w:bCs/>
+        </w:rPr>
+        <w:t xml:space="preserve">Dynamic clearance, contact-force convergence and delivery accuracy are therefore not established.</w:t>
+      </w:r>
+      <w:r>
+        <w:t xml:space="preserve"> </w:t>
+      </w:r>
+      <w:r>
+        <w:t xml:space="preserve">Momentum bookkeeping agreement does not validate contact representation.</w:t>
+      </w:r>
+    </w:p>
+    <w:p>
+      <w:pPr>
+        <w:pStyle w:val="CaptionedFigure"/>
+      </w:pPr>
+      <w:r>
+        <w:drawing>
+          <wp:inline>
+            <wp:extent cx="5279136" cy="2173761"/>
+            <wp:effectExtent b="0" l="0" r="0" t="0"/>
+            <wp:docPr descr="Native contact sensitivity to integration step. The finest run is a numerical comparison reference, not an exact solution; force peaks are not accepted design loads." title="" id="220" name="Picture"/>
+            <a:graphic>
+              <a:graphicData uri="http://schemas.openxmlformats.org/drawingml/2006/picture">
+                <pic:pic>
+                  <pic:nvPicPr>
+                    <pic:cNvPr descr="../validation/feeder_integrity_review/figures/contact_refinement.png" id="221" name="Picture"/>
+                    <pic:cNvPicPr>
+                      <a:picLocks noChangeArrowheads="1" noChangeAspect="1"/>
+                    </pic:cNvPicPr>
+                  </pic:nvPicPr>
+                  <pic:blipFill>
+                    <a:blip r:embed="rId219"/>
+                    <a:stretch>
+                      <a:fillRect/>
+                    </a:stretch>
+                  </pic:blipFill>
+                  <pic:spPr bwMode="auto">
+                    <a:xfrm>
+                      <a:off x="0" y="0"/>
+                      <a:ext cx="5279136" cy="2173761"/>
+                    </a:xfrm>
+                    <a:prstGeom prst="rect">
+                      <a:avLst/>
+                    </a:prstGeom>
+                    <a:noFill/>
+                    <a:ln w="9525">
+                      <a:noFill/>
+                      <a:headEnd/>
+                      <a:tailEnd/>
+                    </a:ln>
+                  </pic:spPr>
+                </pic:pic>
+              </a:graphicData>
+            </a:graphic>
+          </wp:inline>
+        </w:drawing>
+      </w:r>
+    </w:p>
+    <w:p>
+      <w:pPr>
+        <w:pStyle w:val="Caption"/>
+      </w:pPr>
+      <w:r>
+        <w:t xml:space="preserve">Figure </w:t>
+      </w:r>
+      <w:fldSimple w:instr="SEQ Figure \* ARABIC">
+        <w:r>
+          <w:t>33</w:t>
+        </w:r>
+      </w:fldSimple>
+      <w:r>
+        <w:t>: Native contact sensitivity to integration step. The finest run is a numerical comparison reference, not an exact solution; force peaks are not accepted design loads.</w:t>
+      </w:r>
+    </w:p>
+    <w:p>
+      <w:pPr>
+        <w:pStyle w:val="BodyText"/>
+      </w:pPr>
+      <w:r>
+        <w:t xml:space="preserve">These separate Gen6 findings preserve a negative result rather than claim a completed feeder. Axial pin retention, source-rated installed actuators/brake, approved payload rail-end contacts, forward-stop release, full launch/empty return/reset and a universal mixed-size/multi-cell assembly remain unresolved. The evidence-gated seven-architecture downselect remains open.</w:t>
+      </w:r>
+    </w:p>
+    <w:bookmarkEnd w:id="222"/>
+    <w:bookmarkEnd w:id="223"/>
+    <w:bookmarkStart w:id="228" w:name="bibliography"/>
     <w:p>
       <w:pPr>
         <w:pStyle w:val="Heading1"/>
@@ -11042,7 +11322,7 @@
       <w:r>
         <w:t xml:space="preserve"> </w:t>
       </w:r>
-      <w:hyperlink r:id="rId213">
+      <w:hyperlink r:id="rId224">
         <w:r>
           <w:rPr>
             <w:rStyle w:val="Hyperlink"/>
@@ -11193,7 +11473,7 @@
       <w:r>
         <w:t xml:space="preserve"> </w:t>
       </w:r>
-      <w:hyperlink r:id="rId214">
+      <w:hyperlink r:id="rId225">
         <w:r>
           <w:rPr>
             <w:rStyle w:val="Hyperlink"/>
@@ -11257,7 +11537,7 @@
       <w:r>
         <w:t xml:space="preserve"> </w:t>
       </w:r>
-      <w:hyperlink r:id="rId215">
+      <w:hyperlink r:id="rId226">
         <w:r>
           <w:rPr>
             <w:rStyle w:val="Hyperlink"/>
@@ -11457,7 +11737,7 @@
       <w:r>
         <w:t xml:space="preserve"> </w:t>
       </w:r>
-      <w:hyperlink r:id="rId216">
+      <w:hyperlink r:id="rId227">
         <w:r>
           <w:rPr>
             <w:rStyle w:val="Hyperlink"/>
@@ -11469,7 +11749,7 @@
         <w:t xml:space="preserve">. Bibliographic context; not an experimental validation of VOLLEY.</w:t>
       </w:r>
     </w:p>
-    <w:bookmarkEnd w:id="217"/>
+    <w:bookmarkEnd w:id="228"/>
     <w:sectPr>
       <w:footerReference r:id="rId9" w:type="default"/>
       <w:pgSz w:h="16838" w:w="11906"/>

</xml_diff>

<commit_message>
Synchronize contact verification, academic deliverables and project front pages
</commit_message>
<xml_diff>
--- a/university/GEN5_FINAL_YEAR_REPORT.docx
+++ b/university/GEN5_FINAL_YEAR_REPORT.docx
@@ -9323,7 +9323,7 @@
     </w:p>
     <w:bookmarkEnd w:id="151"/>
     <w:bookmarkEnd w:id="152"/>
-    <w:bookmarkStart w:id="223" w:name="separate-gen6-research-studies"/>
+    <w:bookmarkStart w:id="224" w:name="separate-gen6-research-studies"/>
     <w:p>
       <w:pPr>
         <w:pStyle w:val="Heading1"/>
@@ -10980,7 +10980,7 @@
       </w:r>
     </w:p>
     <w:bookmarkEnd w:id="211"/>
-    <w:bookmarkStart w:id="222" w:name="X1b681701ec9e6e2d377679d56180e9ea2366932"/>
+    <w:bookmarkStart w:id="223" w:name="X1b681701ec9e6e2d377679d56180e9ea2366932"/>
     <w:p>
       <w:pPr>
         <w:pStyle w:val="Heading2"/>
@@ -11082,7 +11082,7 @@
         <w:pStyle w:val="BodyText"/>
       </w:pPr>
       <w:r>
-        <w:t xml:space="preserve">A revision audit found that the earlier receiver-fixture results use a different crossbar arrangement. Twelve new native FLR03 cases therefore analyze the actual FM06-R1 solid, alongside forty historical FLR01 cases. Under 1,000 N reference loads and assumed steel stiffness, the 3U one-dog mean loaded-face displacement changes from 1.8829 mm for FM02 to 0.05998 mm for current FM06. The historical FM03 result is 0.05811 mm and is not substituted for the current revision. The largest final FLR03 mesh-to-mesh compliance change is 0.200%. Both pin bores are fully clamped, so the reduction applies to this component fixture and does not bound assembled stiffness. Reaction force and moment balance are checked; no selected alloy allowable or assembled pin-contact acceptance follows.</w:t>
+        <w:t xml:space="preserve">Twelve native FLR03 cases analyze the actual FM06-R1 receiver solid. Forty historical FLR01 cases provide a separately identified revision comparison. Under 1,000 N reference loads and assumed steel stiffness, the 3U one-dog mean loaded-face displacement changes from 1.8829 mm for FM02 to 0.05998 mm for current FM06. The historical FM03 result is 0.05811 mm and is not substituted for the current revision. The largest final FLR03 mesh-to-mesh compliance change is 0.200%. Both pin bores are fully clamped, so the reduction applies to this component fixture and does not bound assembled stiffness. Reaction force and moment balance are checked; no selected alloy allowable or assembled pin-contact acceptance follows.</w:t>
       </w:r>
     </w:p>
     <w:p>
@@ -11169,23 +11169,32 @@
         <w:pStyle w:val="BodyText"/>
       </w:pPr>
       <w:r>
-        <w:t xml:space="preserve">The twelve-case FCE08 Project Chrono campaign evaluates CAD-derived rigid contact, step/iteration sensitivity, assumed friction, a gravity sensitivity and two injected faults. Nominal sequences complete, but force peaks and final poses remain numerically sensitive. Independent exact-solid spot checks find payload/fork intersections in actual simulated poses despite small reported triangle-contact distances.</w:t>
-      </w:r>
-      <w:r>
-        <w:t xml:space="preserve"> </w:t>
-      </w:r>
-      <w:r>
-        <w:rPr>
-          <w:b/>
-          <w:bCs/>
-        </w:rPr>
-        <w:t xml:space="preserve">Dynamic clearance, contact-force convergence and delivery accuracy are therefore not established.</w:t>
-      </w:r>
-      <w:r>
-        <w:t xml:space="preserve"> </w:t>
-      </w:r>
-      <w:r>
-        <w:t xml:space="preserve">Momentum bookkeeping agreement does not validate contact representation.</w:t>
+        <w:t xml:space="preserve">The</w:t>
+      </w:r>
+      <w:r>
+        <w:t xml:space="preserve"> </w:t>
+      </w:r>
+      <w:hyperlink r:id="rId219">
+        <w:r>
+          <w:rPr>
+            <w:rStyle w:val="Hyperlink"/>
+          </w:rPr>
+          <w:t xml:space="preserve">FCE12 contact-verification study</w:t>
+        </w:r>
+      </w:hyperlink>
+      <w:r>
+        <w:t xml:space="preserve"> </w:t>
+      </w:r>
+      <w:r>
+        <w:t xml:space="preserve">uses nine disjoint convex native payload cells and exact orthogonal mechanism cells, with full original body mass and inertia. Internal kg/mm/s scaling is checked against a no-contact SI replay. Fourteen analytical planar-gap controls detect imposed 10 µm–1 mm overlaps; the largest checked reported-gap error is 4.28 nm. This is a calibration of the stated planar controls, not a general contact-accuracy claim.</w:t>
+      </w:r>
+    </w:p>
+    <w:p>
+      <w:pPr>
+        <w:pStyle w:val="BodyText"/>
+      </w:pPr>
+      <w:r>
+        <w:t xml:space="preserve">Ten of twelve native sequences reach the 26.5 s transfer/capture/withdrawal endpoint; deliberate jam and stuck-pin cases abort at 11 s. Independent full-solid checks cover 84 targeted poses. Two residual material intersections, at most 0.000124 mm³, admit a nonintersecting pose after a 1 µm Y translation; original trajectories and residuals remain preserved. These discrete checks do not certify continuous loaded clearance.</w:t>
       </w:r>
     </w:p>
     <w:p>
@@ -11195,20 +11204,20 @@
       <w:r>
         <w:drawing>
           <wp:inline>
-            <wp:extent cx="5279136" cy="2173761"/>
+            <wp:extent cx="5279136" cy="2140982"/>
             <wp:effectExtent b="0" l="0" r="0" t="0"/>
-            <wp:docPr descr="Native contact sensitivity to integration step. The finest run is a numerical comparison reference, not an exact solution; force peaks are not accepted design loads." title="" id="220" name="Picture"/>
+            <wp:docPr descr="Analytical planar-gap controls and fixed-pose replay in the native contact solver. The millimetre-coordinate calculation resolves the imposed overlaps; calibration does not establish final-state convergence or measured precision." title="" id="221" name="Picture"/>
             <a:graphic>
               <a:graphicData uri="http://schemas.openxmlformats.org/drawingml/2006/picture">
                 <pic:pic>
                   <pic:nvPicPr>
-                    <pic:cNvPr descr="../validation/feeder_integrity_review/figures/contact_refinement.png" id="221" name="Picture"/>
+                    <pic:cNvPr descr="../validation/feeder_contact_verification/figures/contact_calibration.png" id="222" name="Picture"/>
                     <pic:cNvPicPr>
                       <a:picLocks noChangeArrowheads="1" noChangeAspect="1"/>
                     </pic:cNvPicPr>
                   </pic:nvPicPr>
                   <pic:blipFill>
-                    <a:blip r:embed="rId219"/>
+                    <a:blip r:embed="rId220"/>
                     <a:stretch>
                       <a:fillRect/>
                     </a:stretch>
@@ -11216,7 +11225,7 @@
                   <pic:spPr bwMode="auto">
                     <a:xfrm>
                       <a:off x="0" y="0"/>
-                      <a:ext cx="5279136" cy="2173761"/>
+                      <a:ext cx="5279136" cy="2140982"/>
                     </a:xfrm>
                     <a:prstGeom prst="rect">
                       <a:avLst/>
@@ -11248,7 +11257,7 @@
         </w:r>
       </w:fldSimple>
       <w:r>
-        <w:t>: Native contact sensitivity to integration step. The finest run is a numerical comparison reference, not an exact solution; force peaks are not accepted design loads.</w:t>
+        <w:t>: Analytical planar-gap controls and fixed-pose replay in the native contact solver. The millimetre-coordinate calculation resolves the imposed overlaps; calibration does not establish final-state convergence or measured precision.</w:t>
       </w:r>
     </w:p>
     <w:p>
@@ -11256,12 +11265,12 @@
         <w:pStyle w:val="BodyText"/>
       </w:pPr>
       <w:r>
-        <w:t xml:space="preserve">These separate Gen6 findings preserve a negative result rather than claim a completed feeder. Axial pin retention, source-rated installed actuators/brake, approved payload rail-end contacts, forward-stop release, full launch/empty return/reset and a universal mixed-size/multi-cell assembly remain unresolved. The evidence-gated seven-architecture downselect remains open.</w:t>
-      </w:r>
-    </w:p>
-    <w:bookmarkEnd w:id="222"/>
+        <w:t xml:space="preserve">The 250-to-125 µs final centre-of-mass differences are 1.509 mm for 1U and 1.466 mm for 3U; the provisional 0.05 mm numerical criterion is not met. Impulsive rigid-contact peaks remain step-sensitive and are not design loads. The capture begins with the storage gate open and does not include free separation or a complete reset. Source-rated installed actuation, actual loaded joints, payload interface approval and mixed-size installed integration remain engineering acceptance requirements. The evidence-gated seven-architecture downselect remains open.</w:t>
+      </w:r>
+    </w:p>
     <w:bookmarkEnd w:id="223"/>
-    <w:bookmarkStart w:id="228" w:name="bibliography"/>
+    <w:bookmarkEnd w:id="224"/>
+    <w:bookmarkStart w:id="229" w:name="bibliography"/>
     <w:p>
       <w:pPr>
         <w:pStyle w:val="Heading1"/>
@@ -11322,7 +11331,7 @@
       <w:r>
         <w:t xml:space="preserve"> </w:t>
       </w:r>
-      <w:hyperlink r:id="rId224">
+      <w:hyperlink r:id="rId225">
         <w:r>
           <w:rPr>
             <w:rStyle w:val="Hyperlink"/>
@@ -11473,7 +11482,7 @@
       <w:r>
         <w:t xml:space="preserve"> </w:t>
       </w:r>
-      <w:hyperlink r:id="rId225">
+      <w:hyperlink r:id="rId226">
         <w:r>
           <w:rPr>
             <w:rStyle w:val="Hyperlink"/>
@@ -11537,7 +11546,7 @@
       <w:r>
         <w:t xml:space="preserve"> </w:t>
       </w:r>
-      <w:hyperlink r:id="rId226">
+      <w:hyperlink r:id="rId227">
         <w:r>
           <w:rPr>
             <w:rStyle w:val="Hyperlink"/>
@@ -11737,7 +11746,7 @@
       <w:r>
         <w:t xml:space="preserve"> </w:t>
       </w:r>
-      <w:hyperlink r:id="rId227">
+      <w:hyperlink r:id="rId228">
         <w:r>
           <w:rPr>
             <w:rStyle w:val="Hyperlink"/>
@@ -11749,7 +11758,7 @@
         <w:t xml:space="preserve">. Bibliographic context; not an experimental validation of VOLLEY.</w:t>
       </w:r>
     </w:p>
-    <w:bookmarkEnd w:id="228"/>
+    <w:bookmarkEnd w:id="229"/>
     <w:sectPr>
       <w:footerReference r:id="rId9" w:type="default"/>
       <w:pgSz w:h="16838" w:w="11906"/>

</xml_diff>

<commit_message>
Synchronize release-reset geometry across academic and project editions
</commit_message>
<xml_diff>
--- a/university/GEN5_FINAL_YEAR_REPORT.docx
+++ b/university/GEN5_FINAL_YEAR_REPORT.docx
@@ -9323,7 +9323,7 @@
     </w:p>
     <w:bookmarkEnd w:id="151"/>
     <w:bookmarkEnd w:id="152"/>
-    <w:bookmarkStart w:id="224" w:name="separate-gen6-research-studies"/>
+    <w:bookmarkStart w:id="225" w:name="separate-gen6-research-studies"/>
     <w:p>
       <w:pPr>
         <w:pStyle w:val="Heading1"/>
@@ -10980,7 +10980,7 @@
       </w:r>
     </w:p>
     <w:bookmarkEnd w:id="211"/>
-    <w:bookmarkStart w:id="223" w:name="X1b681701ec9e6e2d377679d56180e9ea2366932"/>
+    <w:bookmarkStart w:id="224" w:name="X1b681701ec9e6e2d377679d56180e9ea2366932"/>
     <w:p>
       <w:pPr>
         <w:pStyle w:val="Heading2"/>
@@ -11016,6 +11016,31 @@
     </w:p>
     <w:p>
       <w:pPr>
+        <w:pStyle w:val="BodyText"/>
+      </w:pPr>
+      <w:r>
+        <w:t xml:space="preserve">The separate</w:t>
+      </w:r>
+      <w:r>
+        <w:t xml:space="preserve"> </w:t>
+      </w:r>
+      <w:hyperlink r:id="rId213">
+        <w:r>
+          <w:rPr>
+            <w:rStyle w:val="Hyperlink"/>
+          </w:rPr>
+          <w:t xml:space="preserve">FM07-R5 release/reset geometry</w:t>
+        </w:r>
+      </w:hyperlink>
+      <w:r>
+        <w:t xml:space="preserve"> </w:t>
+      </w:r>
+      <w:r>
+        <w:t xml:space="preserve">adds captive receiver pins, a hinged exit gate and empty-carrier reset. Forty-six nominal cycle states and 34 additional rotary samples have no represented collision above the stated numerical threshold. Forty continuous linear sweeps check the prescribed translations; the rotary phases remain discretely sampled. Twenty native/STEP assemblies and 74 part exchanges pass independent readback. The fork/tines and receiver entry-bar material are unchanged from FM06; its isolated fixture results remain distinct from the changed assembled body and hinge. Single-cell mass proxies are 3.7624 kg for 1U and 6.1566 kg for 3U, excluding payload and unmodeled installed hardware. Neither this geometry capture nor the FM06 contact study closes the all-seven architecture-selection gates.</w:t>
+      </w:r>
+    </w:p>
+    <w:p>
+      <w:pPr>
         <w:pStyle w:val="CaptionedFigure"/>
       </w:pPr>
       <w:r>
@@ -11023,18 +11048,18 @@
           <wp:inline>
             <wp:extent cx="5169154" cy="3692252"/>
             <wp:effectExtent b="0" l="0" r="0" t="0"/>
-            <wp:docPr descr="FM06-R1 cassette-to-sled transfer state, rendered from native FreeCAD geometry using Blender Workbench. The payload remains retained; installed actuation, rail-end interfaces and free separation are unresolved." title="" id="214" name="Picture"/>
+            <wp:docPr descr="FM07-R5 exit-open state rendered from native FreeCAD geometry in Blender Workbench. Prescribed geometry only: no launch dynamics, loaded-fit or manufacturing acceptance." title="" id="215" name="Picture"/>
             <a:graphic>
               <a:graphicData uri="http://schemas.openxmlformats.org/drawingml/2006/picture">
                 <pic:pic>
                   <pic:nvPicPr>
-                    <pic:cNvPr descr="../validation/feeder_integrity_review/figures/FM06_Technical_transfer.png" id="215" name="Picture"/>
+                    <pic:cNvPr descr="../validation/feeder_release_review/figures/FM07_Technical_exit_open.png" id="216" name="Picture"/>
                     <pic:cNvPicPr>
                       <a:picLocks noChangeArrowheads="1" noChangeAspect="1"/>
                     </pic:cNvPicPr>
                   </pic:nvPicPr>
                   <pic:blipFill>
-                    <a:blip r:embed="rId213"/>
+                    <a:blip r:embed="rId214"/>
                     <a:stretch>
                       <a:fillRect/>
                     </a:stretch>
@@ -11074,7 +11099,7 @@
         </w:r>
       </w:fldSimple>
       <w:r>
-        <w:t>: FM06-R1 cassette-to-sled transfer state, rendered from native FreeCAD geometry using Blender Workbench. The payload remains retained; installed actuation, rail-end interfaces and free separation are unresolved.</w:t>
+        <w:t>: FM07-R5 exit-open state rendered from native FreeCAD geometry in Blender Workbench. Prescribed geometry only: no launch dynamics, loaded-fit or manufacturing acceptance.</w:t>
       </w:r>
     </w:p>
     <w:p>
@@ -11102,18 +11127,18 @@
           <wp:inline>
             <wp:extent cx="5279136" cy="2227135"/>
             <wp:effectExtent b="0" l="0" r="0" t="0"/>
-            <wp:docPr descr="Native component-fixture compliance comparison. The logarithmic axis covers historical and current receiver revisions under identical reference loads; the supports are idealized clamped bores." title="" id="217" name="Picture"/>
+            <wp:docPr descr="Native component-fixture compliance comparison. The logarithmic axis covers historical and current receiver revisions under identical reference loads; the supports are idealized clamped bores." title="" id="218" name="Picture"/>
             <a:graphic>
               <a:graphicData uri="http://schemas.openxmlformats.org/drawingml/2006/picture">
                 <pic:pic>
                   <pic:nvPicPr>
-                    <pic:cNvPr descr="../validation/feeder_integrity_review/figures/component_compliance.png" id="218" name="Picture"/>
+                    <pic:cNvPr descr="../validation/feeder_integrity_review/figures/component_compliance.png" id="219" name="Picture"/>
                     <pic:cNvPicPr>
                       <a:picLocks noChangeArrowheads="1" noChangeAspect="1"/>
                     </pic:cNvPicPr>
                   </pic:nvPicPr>
                   <pic:blipFill>
-                    <a:blip r:embed="rId216"/>
+                    <a:blip r:embed="rId217"/>
                     <a:stretch>
                       <a:fillRect/>
                     </a:stretch>
@@ -11174,7 +11199,7 @@
       <w:r>
         <w:t xml:space="preserve"> </w:t>
       </w:r>
-      <w:hyperlink r:id="rId219">
+      <w:hyperlink r:id="rId220">
         <w:r>
           <w:rPr>
             <w:rStyle w:val="Hyperlink"/>
@@ -11206,18 +11231,18 @@
           <wp:inline>
             <wp:extent cx="5279136" cy="2140982"/>
             <wp:effectExtent b="0" l="0" r="0" t="0"/>
-            <wp:docPr descr="Analytical planar-gap controls and fixed-pose replay in the native contact solver. The millimetre-coordinate calculation resolves the imposed overlaps; calibration does not establish final-state convergence or measured precision." title="" id="221" name="Picture"/>
+            <wp:docPr descr="Analytical planar-gap controls and fixed-pose replay in the native contact solver. The millimetre-coordinate calculation resolves the imposed overlaps; calibration does not establish final-state convergence or measured precision." title="" id="222" name="Picture"/>
             <a:graphic>
               <a:graphicData uri="http://schemas.openxmlformats.org/drawingml/2006/picture">
                 <pic:pic>
                   <pic:nvPicPr>
-                    <pic:cNvPr descr="../validation/feeder_contact_verification/figures/contact_calibration.png" id="222" name="Picture"/>
+                    <pic:cNvPr descr="../validation/feeder_contact_verification/figures/contact_calibration.png" id="223" name="Picture"/>
                     <pic:cNvPicPr>
                       <a:picLocks noChangeArrowheads="1" noChangeAspect="1"/>
                     </pic:cNvPicPr>
                   </pic:nvPicPr>
                   <pic:blipFill>
-                    <a:blip r:embed="rId220"/>
+                    <a:blip r:embed="rId221"/>
                     <a:stretch>
                       <a:fillRect/>
                     </a:stretch>
@@ -11268,9 +11293,9 @@
         <w:t xml:space="preserve">The 250-to-125 µs final centre-of-mass differences are 1.509 mm for 1U and 1.466 mm for 3U; the provisional 0.05 mm numerical criterion is not met. Impulsive rigid-contact peaks remain step-sensitive and are not design loads. The capture begins with the storage gate open and does not include free separation or a complete reset. Source-rated installed actuation, actual loaded joints, payload interface approval and mixed-size installed integration remain engineering acceptance requirements. The evidence-gated seven-architecture downselect remains open.</w:t>
       </w:r>
     </w:p>
-    <w:bookmarkEnd w:id="223"/>
     <w:bookmarkEnd w:id="224"/>
-    <w:bookmarkStart w:id="229" w:name="bibliography"/>
+    <w:bookmarkEnd w:id="225"/>
+    <w:bookmarkStart w:id="230" w:name="bibliography"/>
     <w:p>
       <w:pPr>
         <w:pStyle w:val="Heading1"/>
@@ -11331,7 +11356,7 @@
       <w:r>
         <w:t xml:space="preserve"> </w:t>
       </w:r>
-      <w:hyperlink r:id="rId225">
+      <w:hyperlink r:id="rId226">
         <w:r>
           <w:rPr>
             <w:rStyle w:val="Hyperlink"/>
@@ -11482,7 +11507,7 @@
       <w:r>
         <w:t xml:space="preserve"> </w:t>
       </w:r>
-      <w:hyperlink r:id="rId226">
+      <w:hyperlink r:id="rId227">
         <w:r>
           <w:rPr>
             <w:rStyle w:val="Hyperlink"/>
@@ -11546,7 +11571,7 @@
       <w:r>
         <w:t xml:space="preserve"> </w:t>
       </w:r>
-      <w:hyperlink r:id="rId227">
+      <w:hyperlink r:id="rId228">
         <w:r>
           <w:rPr>
             <w:rStyle w:val="Hyperlink"/>
@@ -11746,7 +11771,7 @@
       <w:r>
         <w:t xml:space="preserve"> </w:t>
       </w:r>
-      <w:hyperlink r:id="rId228">
+      <w:hyperlink r:id="rId229">
         <w:r>
           <w:rPr>
             <w:rStyle w:val="Hyperlink"/>
@@ -11758,7 +11783,7 @@
         <w:t xml:space="preserve">. Bibliographic context; not an experimental validation of VOLLEY.</w:t>
       </w:r>
     </w:p>
-    <w:bookmarkEnd w:id="229"/>
+    <w:bookmarkEnd w:id="230"/>
     <w:sectPr>
       <w:footerReference r:id="rId9" w:type="default"/>
       <w:pgSz w:h="16838" w:w="11906"/>

</xml_diff>

<commit_message>
Adopt commanded electromagnetic deployment study title across academic editions
</commit_message>
<xml_diff>
--- a/university/GEN5_FINAL_YEAR_REPORT.docx
+++ b/university/GEN5_FINAL_YEAR_REPORT.docx
@@ -23,7 +23,7 @@
           <w:b/>
           <w:sz w:val="36"/>
         </w:rPr>
-        <w:t>VOLLEY Gen5</w:t>
+        <w:t>VOLLEY</w:t>
       </w:r>
     </w:p>
     <w:p>
@@ -35,7 +35,7 @@
           <w:b/>
           <w:sz w:val="32"/>
         </w:rPr>
-        <w:t>Computational Feasibility and Engineering Disposition of a CubeSat Deployer</w:t>
+        <w:t>Design and Computational Feasibility Assessment of a Commanded Electromagnetic CubeSat Deployment Mechanism</w:t>
       </w:r>
     </w:p>
     <w:p>

</xml_diff>

<commit_message>
Add common-boundary feeder CAD and verified computational study findings
</commit_message>
<xml_diff>
--- a/university/GEN5_FINAL_YEAR_REPORT.docx
+++ b/university/GEN5_FINAL_YEAR_REPORT.docx
@@ -649,7 +649,7 @@
         <w:pStyle w:val="BodyText"/>
       </w:pPr>
       <w:r>
-        <w:t xml:space="preserve">This issue contains the evaluated Gen5 study and separately identified Gen6 research through 21 October 2026. It is issued for first similarity review; institutional approval and the similarity result are not asserted. Gen6 research does not alter the evaluated Gen5 configuration.</w:t>
+        <w:t xml:space="preserve">This issue contains the evaluated Gen5 study and separately identified Gen6 research through 22 October 2026. It is issued for first similarity review; institutional approval and the similarity result are not asserted. Gen6 research does not alter the evaluated Gen5 configuration.</w:t>
       </w:r>
     </w:p>
     <w:p>
@@ -9323,7 +9323,7 @@
     </w:p>
     <w:bookmarkEnd w:id="151"/>
     <w:bookmarkEnd w:id="152"/>
-    <w:bookmarkStart w:id="225" w:name="separate-gen6-research-studies"/>
+    <w:bookmarkStart w:id="247" w:name="separate-gen6-research-studies"/>
     <w:p>
       <w:pPr>
         <w:pStyle w:val="Heading1"/>
@@ -11294,8 +11294,1227 @@
       </w:r>
     </w:p>
     <w:bookmarkEnd w:id="224"/>
-    <w:bookmarkEnd w:id="225"/>
-    <w:bookmarkStart w:id="230" w:name="bibliography"/>
+    <w:bookmarkStart w:id="226" w:name="end-effects-and-research-evidence"/>
+    <w:p>
+      <w:pPr>
+        <w:pStyle w:val="Heading2"/>
+      </w:pPr>
+      <w:r>
+        <w:t>C.9 End effects and research evidence</w:t>
+      </w:r>
+    </w:p>
+    <w:p>
+      <w:pPr>
+        <w:pStyle w:val="FirstParagraph"/>
+      </w:pPr>
+      <w:r>
+        <w:t xml:space="preserve">The</w:t>
+      </w:r>
+      <w:r>
+        <w:t xml:space="preserve"> </w:t>
+      </w:r>
+      <w:hyperlink r:id="rId225">
+        <w:r>
+          <w:rPr>
+            <w:rStyle w:val="Hyperlink"/>
+          </w:rPr>
+          <w:t xml:space="preserve">targeted reference review</w:t>
+        </w:r>
+      </w:hyperlink>
+      <w:r>
+        <w:t xml:space="preserve"> </w:t>
+      </w:r>
+      <w:r>
+        <w:t xml:space="preserve">checks selected methods/results/conclusion passages in the Japanese original of the Halbach end-effect study (DOI 10.1541/ieejias.143.570; English translation DOI 10.1002/eej.23450). Its 2D/JMAG comparison and conditional coil-coverage cancellation method provide context, not finite-width 3D or hardware validation of VOLLEY. No numerical correction is imported. Full text of the close double-magnetic-circuit CubeSat actuator article (DOI 10.1109/TIE.2021.3134060) was not available in the bounded lawful-access search; it remains metadata/abstract-only and supplies no quantitative performance or interface claim.</w:t>
+      </w:r>
+    </w:p>
+    <w:bookmarkEnd w:id="226"/>
+    <w:bookmarkStart w:id="231" w:name="X4570ff53ae1e04d9392e6cc412ad79126651ebd"/>
+    <w:p>
+      <w:pPr>
+        <w:pStyle w:val="Heading2"/>
+      </w:pPr>
+      <w:r>
+        <w:t>C.10 Continuous rotary-clearance check: FM07-R6</w:t>
+      </w:r>
+    </w:p>
+    <w:p>
+      <w:pPr>
+        <w:pStyle w:val="FirstParagraph"/>
+      </w:pPr>
+      <w:r>
+        <w:t xml:space="preserve">The</w:t>
+      </w:r>
+      <w:r>
+        <w:t xml:space="preserve"> </w:t>
+      </w:r>
+      <w:hyperlink r:id="rId227">
+        <w:r>
+          <w:rPr>
+            <w:rStyle w:val="Hyperlink"/>
+          </w:rPr>
+          <w:t xml:space="preserve">RVC01 native CAD study</w:t>
+        </w:r>
+      </w:hyperlink>
+      <w:r>
+        <w:t xml:space="preserve"> </w:t>
+      </w:r>
+      <w:r>
+        <w:t xml:space="preserve">examines the four rotary phases separately from the R5 sampled-angle evidence. Near the closed state, the R5 gate lower edge and sled deck both lie at 22 mm. Native distance is zero while their intersection volume is zero: this is surface contact, not a demonstrated positive-volume collision.</w:t>
+      </w:r>
+    </w:p>
+    <w:p>
+      <w:pPr>
+        <w:pStyle w:val="BodyText"/>
+      </w:pPr>
+      <w:r>
+        <w:t xml:space="preserve">FM07-R6 is a separate candidate revision. Raising only the gate panel lower edge by 0.25 mm, while retaining its upper edge, hinge and locks, removes 41 mm³ of steel per gate (0.32185 g at the assumed density). Adaptive angle-interval checks use native B-rep distances, a rigid-rotation displacement bound and a 0.00001 mm numerical guard. All four complete 0–90° opening/closing screens pass; the smallest guarded conservative bound is 0.0098846 mm. This is a numerical nominal-geometry bound, not a manufactured clearance or certified kernel error enclosure.</w:t>
+      </w:r>
+    </w:p>
+    <w:p>
+      <w:pPr>
+        <w:pStyle w:val="BodyText"/>
+      </w:pPr>
+      <w:r>
+        <w:t xml:space="preserve">Eight full assembly exports and two individual gate STEP files pass separate CadQuery/OpenCascade readback. Eight source/delta checks confirm that the other components are unchanged and that the corrected gate is a material subset of R5. The separate importer uses the same kernel family. The change does not establish loaded clearance, tolerance acceptance, actuation, contact convergence or architecture selection.</w:t>
+      </w:r>
+    </w:p>
+    <w:p>
+      <w:pPr>
+        <w:pStyle w:val="CaptionedFigure"/>
+      </w:pPr>
+      <w:r>
+        <w:drawing>
+          <wp:inline>
+            <wp:extent cx="5389118" cy="1856251"/>
+            <wp:effectExtent b="0" l="0" r="0" t="0"/>
+            <wp:docPr descr="Native gate/deck distance and conservative complete-angle screen. The 0.25 mm panel relief differs from the smallest global guarded bound. Source: RVC01, FM07-R6; nominal prescribed geometry." title="" id="229" name="Picture"/>
+            <a:graphic>
+              <a:graphicData uri="http://schemas.openxmlformats.org/drawingml/2006/picture">
+                <pic:pic>
+                  <pic:nvPicPr>
+                    <pic:cNvPr descr="../validation/feeder_rotary_clearance/figures/rotary_clearance.png" id="230" name="Picture"/>
+                    <pic:cNvPicPr>
+                      <a:picLocks noChangeArrowheads="1" noChangeAspect="1"/>
+                    </pic:cNvPicPr>
+                  </pic:nvPicPr>
+                  <pic:blipFill>
+                    <a:blip r:embed="rId228"/>
+                    <a:stretch>
+                      <a:fillRect/>
+                    </a:stretch>
+                  </pic:blipFill>
+                  <pic:spPr bwMode="auto">
+                    <a:xfrm>
+                      <a:off x="0" y="0"/>
+                      <a:ext cx="5389118" cy="1856251"/>
+                    </a:xfrm>
+                    <a:prstGeom prst="rect">
+                      <a:avLst/>
+                    </a:prstGeom>
+                    <a:noFill/>
+                    <a:ln w="9525">
+                      <a:noFill/>
+                      <a:headEnd/>
+                      <a:tailEnd/>
+                    </a:ln>
+                  </pic:spPr>
+                </pic:pic>
+              </a:graphicData>
+            </a:graphic>
+          </wp:inline>
+        </w:drawing>
+      </w:r>
+    </w:p>
+    <w:p>
+      <w:pPr>
+        <w:pStyle w:val="Caption"/>
+      </w:pPr>
+      <w:r>
+        <w:t xml:space="preserve">Figure </w:t>
+      </w:r>
+      <w:fldSimple w:instr="SEQ Figure \* ARABIC">
+        <w:r>
+          <w:t>34</w:t>
+        </w:r>
+      </w:fldSimple>
+      <w:r>
+        <w:t>: Native gate/deck distance and conservative complete-angle screen. The 0.25 mm panel relief differs from the smallest global guarded bound. Source: RVC01, FM07-R6; nominal prescribed geometry.</w:t>
+      </w:r>
+    </w:p>
+    <w:bookmarkEnd w:id="231"/>
+    <w:bookmarkStart w:id="236" w:name="contact-model-numerical-diagnosis-fce13"/>
+    <w:p>
+      <w:pPr>
+        <w:pStyle w:val="Heading2"/>
+      </w:pPr>
+      <w:r>
+        <w:t>C.11 Contact-model numerical diagnosis: FCE13</w:t>
+      </w:r>
+    </w:p>
+    <w:p>
+      <w:pPr>
+        <w:pStyle w:val="FirstParagraph"/>
+      </w:pPr>
+      <w:r>
+        <w:t xml:space="preserve">The</w:t>
+      </w:r>
+      <w:r>
+        <w:t xml:space="preserve"> </w:t>
+      </w:r>
+      <w:hyperlink r:id="rId232">
+        <w:r>
+          <w:rPr>
+            <w:rStyle w:val="Hyperlink"/>
+          </w:rPr>
+          <w:t xml:space="preserve">FCE13 diagnosis</w:t>
+        </w:r>
+      </w:hyperlink>
+      <w:r>
+        <w:t xml:space="preserve"> </w:t>
+      </w:r>
+      <w:r>
+        <w:t xml:space="preserve">retains FM06-R1 geometry and physical assumptions. Six additional native Chrono runs reach the common 26.5 s endpoint. Instrumentation reproduces the original 3U 250 µs trajectory byte for byte. Solver-budget use concentrates during feed deceleration, before receiver capture. Neither warm starting nor a preconditioned Barzilai–Borwein solver establishes final-state convergence. Replacing the rectangular core mesh with the exactly equivalent native box also fails the pose screens; at 125 µs, the representation alone changes the endpoint by 0.755420 mm and 0.603748°.</w:t>
+      </w:r>
+    </w:p>
+    <w:p>
+      <w:pPr>
+        <w:pStyle w:val="Caption"/>
+      </w:pPr>
+      <w:r>
+        <w:t xml:space="preserve">Table </w:t>
+      </w:r>
+      <w:fldSimple w:instr="SEQ Table \* ARABIC">
+        <w:r>
+          <w:t>13</w:t>
+        </w:r>
+      </w:fldSimple>
+      <w:r>
+        <w:t>: FCE13 common-endpoint 250-to-125 µs comparisons. Acceptance limits remain 0.05 mm COM and 0.05° orientation.</w:t>
+      </w:r>
+    </w:p>
+    <w:tbl>
+      <w:tblPr>
+        <w:tblStyle w:val="Table"/>
+        <w:tblW w:type="pct" w:w="5000"/>
+        <w:jc w:val="left"/>
+        <w:tblLayout w:type="fixed"/>
+        <w:tblLook w:firstRow="1" w:lastRow="0" w:firstColumn="0" w:lastColumn="0" w:noHBand="0" w:noVBand="0" w:val="0020"/>
+        <w:tblCaption w:val="Table 13: FCE13 common-endpoint 250-to-125 µs comparisons. Acceptance limits remain 0.05 mm COM and 0.05° orientation."/>
+      </w:tblPr>
+      <w:tblGrid>
+        <w:gridCol w:w="1980"/>
+        <w:gridCol w:w="1980"/>
+        <w:gridCol w:w="1980"/>
+        <w:gridCol w:w="1980"/>
+      </w:tblGrid>
+      <w:tr>
+        <w:trPr>
+          <w:tblHeader w:val="on"/>
+        </w:trPr>
+        <w:tc>
+          <w:tcPr/>
+          <w:p>
+            <w:pPr>
+              <w:pStyle w:val="Compact"/>
+              <w:jc w:val="left"/>
+            </w:pPr>
+            <w:r>
+              <w:t xml:space="preserve">Refinement comparison</w:t>
+            </w:r>
+          </w:p>
+        </w:tc>
+        <w:tc>
+          <w:tcPr/>
+          <w:p>
+            <w:pPr>
+              <w:pStyle w:val="Compact"/>
+              <w:jc w:val="right"/>
+            </w:pPr>
+            <w:r>
+              <w:t xml:space="preserve">COM change [mm]</w:t>
+            </w:r>
+          </w:p>
+        </w:tc>
+        <w:tc>
+          <w:tcPr/>
+          <w:p>
+            <w:pPr>
+              <w:pStyle w:val="Compact"/>
+              <w:jc w:val="right"/>
+            </w:pPr>
+            <w:r>
+              <w:t xml:space="preserve">Orientation change [deg]</w:t>
+            </w:r>
+          </w:p>
+        </w:tc>
+        <w:tc>
+          <w:tcPr/>
+          <w:p>
+            <w:pPr>
+              <w:pStyle w:val="Compact"/>
+              <w:jc w:val="left"/>
+            </w:pPr>
+            <w:r>
+              <w:t xml:space="preserve">Retained pose screen</w:t>
+            </w:r>
+          </w:p>
+        </w:tc>
+      </w:tr>
+      <w:tr>
+        <w:tc>
+          <w:tcPr/>
+          <w:p>
+            <w:pPr>
+              <w:pStyle w:val="Compact"/>
+              <w:jc w:val="left"/>
+            </w:pPr>
+            <w:r>
+              <w:t xml:space="preserve">Original PSOR, 1U</w:t>
+            </w:r>
+          </w:p>
+        </w:tc>
+        <w:tc>
+          <w:tcPr/>
+          <w:p>
+            <w:pPr>
+              <w:pStyle w:val="Compact"/>
+              <w:jc w:val="right"/>
+            </w:pPr>
+            <w:r>
+              <w:t xml:space="preserve">1.508584</w:t>
+            </w:r>
+          </w:p>
+        </w:tc>
+        <w:tc>
+          <w:tcPr/>
+          <w:p>
+            <w:pPr>
+              <w:pStyle w:val="Compact"/>
+              <w:jc w:val="right"/>
+            </w:pPr>
+            <w:r>
+              <w:t xml:space="preserve">0.639678</w:t>
+            </w:r>
+          </w:p>
+        </w:tc>
+        <w:tc>
+          <w:tcPr/>
+          <w:p>
+            <w:pPr>
+              <w:pStyle w:val="Compact"/>
+              <w:jc w:val="left"/>
+            </w:pPr>
+            <w:r>
+              <w:t xml:space="preserve">Fail</w:t>
+            </w:r>
+          </w:p>
+        </w:tc>
+      </w:tr>
+      <w:tr>
+        <w:tc>
+          <w:tcPr/>
+          <w:p>
+            <w:pPr>
+              <w:pStyle w:val="Compact"/>
+              <w:jc w:val="left"/>
+            </w:pPr>
+            <w:r>
+              <w:t xml:space="preserve">Original PSOR, 3U</w:t>
+            </w:r>
+          </w:p>
+        </w:tc>
+        <w:tc>
+          <w:tcPr/>
+          <w:p>
+            <w:pPr>
+              <w:pStyle w:val="Compact"/>
+              <w:jc w:val="right"/>
+            </w:pPr>
+            <w:r>
+              <w:t xml:space="preserve">1.466380</w:t>
+            </w:r>
+          </w:p>
+        </w:tc>
+        <w:tc>
+          <w:tcPr/>
+          <w:p>
+            <w:pPr>
+              <w:pStyle w:val="Compact"/>
+              <w:jc w:val="right"/>
+            </w:pPr>
+            <w:r>
+              <w:t xml:space="preserve">0.232303</w:t>
+            </w:r>
+          </w:p>
+        </w:tc>
+        <w:tc>
+          <w:tcPr/>
+          <w:p>
+            <w:pPr>
+              <w:pStyle w:val="Compact"/>
+              <w:jc w:val="left"/>
+            </w:pPr>
+            <w:r>
+              <w:t xml:space="preserve">Fail</w:t>
+            </w:r>
+          </w:p>
+        </w:tc>
+      </w:tr>
+      <w:tr>
+        <w:tc>
+          <w:tcPr/>
+          <w:p>
+            <w:pPr>
+              <w:pStyle w:val="Compact"/>
+              <w:jc w:val="left"/>
+            </w:pPr>
+            <w:r>
+              <w:t xml:space="preserve">Native BB, 3U</w:t>
+            </w:r>
+          </w:p>
+        </w:tc>
+        <w:tc>
+          <w:tcPr/>
+          <w:p>
+            <w:pPr>
+              <w:pStyle w:val="Compact"/>
+              <w:jc w:val="right"/>
+            </w:pPr>
+            <w:r>
+              <w:t xml:space="preserve">1.926456</w:t>
+            </w:r>
+          </w:p>
+        </w:tc>
+        <w:tc>
+          <w:tcPr/>
+          <w:p>
+            <w:pPr>
+              <w:pStyle w:val="Compact"/>
+              <w:jc w:val="right"/>
+            </w:pPr>
+            <w:r>
+              <w:t xml:space="preserve">0.120098</w:t>
+            </w:r>
+          </w:p>
+        </w:tc>
+        <w:tc>
+          <w:tcPr/>
+          <w:p>
+            <w:pPr>
+              <w:pStyle w:val="Compact"/>
+              <w:jc w:val="left"/>
+            </w:pPr>
+            <w:r>
+              <w:t xml:space="preserve">Fail</w:t>
+            </w:r>
+          </w:p>
+        </w:tc>
+      </w:tr>
+      <w:tr>
+        <w:tc>
+          <w:tcPr/>
+          <w:p>
+            <w:pPr>
+              <w:pStyle w:val="Compact"/>
+              <w:jc w:val="left"/>
+            </w:pPr>
+            <w:r>
+              <w:t xml:space="preserve">Equivalent box core / PSOR, 3U</w:t>
+            </w:r>
+          </w:p>
+        </w:tc>
+        <w:tc>
+          <w:tcPr/>
+          <w:p>
+            <w:pPr>
+              <w:pStyle w:val="Compact"/>
+              <w:jc w:val="right"/>
+            </w:pPr>
+            <w:r>
+              <w:t xml:space="preserve">0.716162</w:t>
+            </w:r>
+          </w:p>
+        </w:tc>
+        <w:tc>
+          <w:tcPr/>
+          <w:p>
+            <w:pPr>
+              <w:pStyle w:val="Compact"/>
+              <w:jc w:val="right"/>
+            </w:pPr>
+            <w:r>
+              <w:t xml:space="preserve">0.564333</w:t>
+            </w:r>
+          </w:p>
+        </w:tc>
+        <w:tc>
+          <w:tcPr/>
+          <w:p>
+            <w:pPr>
+              <w:pStyle w:val="Compact"/>
+              <w:jc w:val="left"/>
+            </w:pPr>
+            <w:r>
+              <w:t xml:space="preserve">Fail</w:t>
+            </w:r>
+          </w:p>
+        </w:tc>
+      </w:tr>
+    </w:tbl>
+    <w:p>
+      <w:pPr>
+        <w:pStyle w:val="BodyText"/>
+      </w:pPr>
+      <w:r>
+        <w:t xml:space="preserve">Work differences remain below the separate 1% screen, which does not establish pose or contact-load convergence. Two terminated APGD pilots are archived and excluded from endpoint comparisons. Native solver residuals have different definitions across PSOR and BB and are not directly interchangeable. These observations quantify tested numerical sensitivity; they are not bounds on the exact solution. No numerical correction is adopted, no rigid-contact force rating is established, and FM06 contact results are not transferred to FM07-R6.</w:t>
+      </w:r>
+    </w:p>
+    <w:p>
+      <w:pPr>
+        <w:pStyle w:val="CaptionedFigure"/>
+      </w:pPr>
+      <w:r>
+        <w:drawing>
+          <wp:inline>
+            <wp:extent cx="5499100" cy="2023974"/>
+            <wp:effectExtent b="0" l="0" r="0" t="0"/>
+            <wp:docPr descr="Common-time refinement differences and full 2,000-iteration-budget use in native Chrono. P: PSOR; W: warm-start PSOR; BB: preconditioned BB; Box: equivalent box core with PSOR. Shading marks feed deceleration. Dashed lines retain the 0.05 mm and 0.05° screens. A full-budget solve may first meet tolerance at its final iteration; budget counts alone are not residual convergence tests. Source: FCE13, FM06-R1." title="" id="234" name="Picture"/>
+            <a:graphic>
+              <a:graphicData uri="http://schemas.openxmlformats.org/drawingml/2006/picture">
+                <pic:pic>
+                  <pic:nvPicPr>
+                    <pic:cNvPr descr="../validation/feeder_contact_diagnosis/convergence_publication.png" id="235" name="Picture"/>
+                    <pic:cNvPicPr>
+                      <a:picLocks noChangeArrowheads="1" noChangeAspect="1"/>
+                    </pic:cNvPicPr>
+                  </pic:nvPicPr>
+                  <pic:blipFill>
+                    <a:blip r:embed="rId233"/>
+                    <a:stretch>
+                      <a:fillRect/>
+                    </a:stretch>
+                  </pic:blipFill>
+                  <pic:spPr bwMode="auto">
+                    <a:xfrm>
+                      <a:off x="0" y="0"/>
+                      <a:ext cx="5499100" cy="2023974"/>
+                    </a:xfrm>
+                    <a:prstGeom prst="rect">
+                      <a:avLst/>
+                    </a:prstGeom>
+                    <a:noFill/>
+                    <a:ln w="9525">
+                      <a:noFill/>
+                      <a:headEnd/>
+                      <a:tailEnd/>
+                    </a:ln>
+                  </pic:spPr>
+                </pic:pic>
+              </a:graphicData>
+            </a:graphic>
+          </wp:inline>
+        </w:drawing>
+      </w:r>
+    </w:p>
+    <w:p>
+      <w:pPr>
+        <w:pStyle w:val="Caption"/>
+      </w:pPr>
+      <w:r>
+        <w:t xml:space="preserve">Figure </w:t>
+      </w:r>
+      <w:fldSimple w:instr="SEQ Figure \* ARABIC">
+        <w:r>
+          <w:t>35</w:t>
+        </w:r>
+      </w:fldSimple>
+      <w:r>
+        <w:t>: Common-time refinement differences and full 2,000-iteration-budget use in native Chrono. P: PSOR; W: warm-start PSOR; BB: preconditioned BB; Box: equivalent box core with PSOR. Shading marks feed deceleration. Dashed lines retain the 0.05 mm and 0.05° screens. A full-budget solve may first meet tolerance at its final iteration; budget counts alone are not residual convergence tests. Source: FCE13, FM06-R1.</w:t>
+      </w:r>
+    </w:p>
+    <w:bookmarkEnd w:id="236"/>
+    <w:bookmarkStart w:id="241" w:name="X4644e67e9b4912e0b76de2de3d113bf8a2ed778"/>
+    <w:p>
+      <w:pPr>
+        <w:pStyle w:val="Heading2"/>
+      </w:pPr>
+      <w:r>
+        <w:t>C.12 Lunar and upper-speed compatibility bounds</w:t>
+      </w:r>
+    </w:p>
+    <w:p>
+      <w:pPr>
+        <w:pStyle w:val="FirstParagraph"/>
+      </w:pPr>
+      <w:r>
+        <w:t xml:space="preserve">The</w:t>
+      </w:r>
+      <w:r>
+        <w:t xml:space="preserve"> </w:t>
+      </w:r>
+      <w:hyperlink r:id="rId237">
+        <w:r>
+          <w:rPr>
+            <w:rStyle w:val="Hyperlink"/>
+          </w:rPr>
+          <w:t xml:space="preserve">standalone analytical study</w:t>
+        </w:r>
+      </w:hyperlink>
+      <w:r>
+        <w:t xml:space="preserve"> </w:t>
+      </w:r>
+      <w:r>
+        <w:t xml:space="preserve">separates carrier propulsion and payload release. An ideal coplanar, tangential patched-conic screen gives Earth departure 3.106427 km/s, lunar arrival excess speed 0.830117 km/s and direct capture into a 100 km circular lunar orbit 821.239408 m/s. It does not include finite sphere-of-influence or epoch targeting. Capture into a 100 × 10,000 km ellipse initially needs 306.643674 m/s, but later circularization at the same perilune restores the same total impulse. No net saving follows when the endpoint is held fixed.</w:t>
+      </w:r>
+    </w:p>
+    <w:p>
+      <w:pPr>
+        <w:pStyle w:val="BodyText"/>
+      </w:pPr>
+      <w:r>
+        <w:t xml:space="preserve">Ideal engine-only escape thresholds from the three staging examples are 676.620, 523.149 and 162.024 m/s. The assumed 200 m/s allowance cannot establish escape from the first two. Reference-sphere grazing is a geometric limit, not a targeted disposal solution; no-shot release-recoil credit is zero. Useful lunar lifetime, navigation covariance, a complete carrier campaign, resource/thermal closure and controlled disposal remain unresolved.</w:t>
+      </w:r>
+    </w:p>
+    <w:p>
+      <w:pPr>
+        <w:pStyle w:val="BodyText"/>
+      </w:pPr>
+      <w:r>
+        <w:t xml:space="preserve">For a 4 kg payload and 300 kg retained host, 1 km/s relative release needs at least 1.973684 MJ ideal added relative energy and 2.012598 km constant-force stroke at a 25 g study ceiling. This rejects the declared compact/low-acceleration combination; the acceleration is not a payload rating. Source, moving-pusher, friction, charging and catcher burdens remain additional. The near-term moderate-speed Gen6 article and upper-speed investigation are therefore separate studies.</w:t>
+      </w:r>
+    </w:p>
+    <w:p>
+      <w:pPr>
+        <w:pStyle w:val="BodyText"/>
+      </w:pPr>
+      <w:r>
+        <w:t xml:space="preserve">Nine algebraic checks reproduce 182 numerical fields. The source package retains a historical C0-S2 criteria-hash mismatch explicitly; it does not certify that earlier criteria provenance or a perturbed lunar mission. The new calculations are conditional analytical bounds, not a selected provider, hardware rating or flight validation.</w:t>
+      </w:r>
+    </w:p>
+    <w:p>
+      <w:pPr>
+        <w:pStyle w:val="CaptionedFigure"/>
+      </w:pPr>
+      <w:r>
+        <w:drawing>
+          <wp:inline>
+            <wp:extent cx="5389118" cy="2095768"/>
+            <wp:effectExtent b="0" l="0" r="0" t="0"/>
+            <wp:docPr descr="Ideal stroke compatibility and capture/circularization accounting for a common final lunar orbit. Assumed payload/host masses and acceleration screens are stated in the source package; no useful lifetime or provider performance is established." title="" id="239" name="Picture"/>
+            <a:graphic>
+              <a:graphicData uri="http://schemas.openxmlformats.org/drawingml/2006/picture">
+                <pic:pic>
+                  <pic:nvPicPr>
+                    <pic:cNvPr descr="../validation/extended_feasibility_bounds/feasibility_bounds.png" id="240" name="Picture"/>
+                    <pic:cNvPicPr>
+                      <a:picLocks noChangeArrowheads="1" noChangeAspect="1"/>
+                    </pic:cNvPicPr>
+                  </pic:nvPicPr>
+                  <pic:blipFill>
+                    <a:blip r:embed="rId238"/>
+                    <a:stretch>
+                      <a:fillRect/>
+                    </a:stretch>
+                  </pic:blipFill>
+                  <pic:spPr bwMode="auto">
+                    <a:xfrm>
+                      <a:off x="0" y="0"/>
+                      <a:ext cx="5389118" cy="2095768"/>
+                    </a:xfrm>
+                    <a:prstGeom prst="rect">
+                      <a:avLst/>
+                    </a:prstGeom>
+                    <a:noFill/>
+                    <a:ln w="9525">
+                      <a:noFill/>
+                      <a:headEnd/>
+                      <a:tailEnd/>
+                    </a:ln>
+                  </pic:spPr>
+                </pic:pic>
+              </a:graphicData>
+            </a:graphic>
+          </wp:inline>
+        </w:drawing>
+      </w:r>
+    </w:p>
+    <w:p>
+      <w:pPr>
+        <w:pStyle w:val="Caption"/>
+      </w:pPr>
+      <w:r>
+        <w:t xml:space="preserve">Figure </w:t>
+      </w:r>
+      <w:fldSimple w:instr="SEQ Figure \* ARABIC">
+        <w:r>
+          <w:t>36</w:t>
+        </w:r>
+      </w:fldSimple>
+      <w:r>
+        <w:t>: Ideal stroke compatibility and capture/circularization accounting for a common final lunar orbit. Assumed payload/host masses and acceleration screens are stated in the source package; no useful lifetime or provider performance is established.</w:t>
+      </w:r>
+    </w:p>
+    <w:bookmarkEnd w:id="241"/>
+    <w:bookmarkStart w:id="246" w:name="X27297ddec29e86494f6fd27f2966eee8e13020a"/>
+    <w:p>
+      <w:pPr>
+        <w:pStyle w:val="Heading2"/>
+      </w:pPr>
+      <w:r>
+        <w:t>C.13 Seven-feeder common-boundary CAD comparison: FDR09</w:t>
+      </w:r>
+    </w:p>
+    <w:p>
+      <w:pPr>
+        <w:pStyle w:val="FirstParagraph"/>
+      </w:pPr>
+      <w:r>
+        <w:t xml:space="preserve">The</w:t>
+      </w:r>
+      <w:r>
+        <w:t xml:space="preserve"> </w:t>
+      </w:r>
+      <w:hyperlink r:id="rId242">
+        <w:r>
+          <w:rPr>
+            <w:rStyle w:val="Hyperlink"/>
+          </w:rPr>
+          <w:t xml:space="preserve">FDR09 development study</w:t>
+        </w:r>
+      </w:hyperlink>
+      <w:r>
+        <w:t xml:space="preserve"> </w:t>
+      </w:r>
+      <w:r>
+        <w:t xml:space="preserve">replaces unequal one-cell/four-cell mass comparisons with a declared four-payload inventory: two 1U and two 3U satellites, one common receiver and separate local feed stations. Fixed-cell candidates model a 900 mm shared receiver travel on 1,600 mm rails; the drum retains a distinct index/extraction arrangement. Common 3U outer handling packages use passive 1U inserts, each with modeled mass 0.185933 kg. This packaging is not an optimized storage-density result or a qualified spacecraft interface.</w:t>
+      </w:r>
+    </w:p>
+    <w:p>
+      <w:pPr>
+        <w:pStyle w:val="Caption"/>
+      </w:pPr>
+      <w:r>
+        <w:t xml:space="preserve">Table </w:t>
+      </w:r>
+      <w:fldSimple w:instr="SEQ Table \* ARABIC">
+        <w:r>
+          <w:t>14</w:t>
+        </w:r>
+      </w:fldSimple>
+      <w:r>
+        <w:t>: FDR09-R1 partial mass accounting. Catalog options are not integrated or qualified. Neither column establishes full installed mass, CG or inertia; missing hardware is not assigned zero mass.</w:t>
+      </w:r>
+    </w:p>
+    <w:tbl>
+      <w:tblPr>
+        <w:tblStyle w:val="Table"/>
+        <w:tblW w:type="pct" w:w="5000"/>
+        <w:jc w:val="left"/>
+        <w:tblLayout w:type="fixed"/>
+        <w:tblLook w:firstRow="1" w:lastRow="0" w:firstColumn="0" w:lastColumn="0" w:noHBand="0" w:noVBand="0" w:val="0020"/>
+        <w:tblCaption w:val="Table 14: FDR09-R1 partial mass accounting. Catalog options are not integrated or qualified. Neither column establishes full installed mass, CG or inertia; missing hardware is not assigned zero mass."/>
+      </w:tblPr>
+      <w:tblGrid>
+        <w:gridCol w:w="1980"/>
+        <w:gridCol w:w="1980"/>
+        <w:gridCol w:w="1980"/>
+        <w:gridCol w:w="1980"/>
+      </w:tblGrid>
+      <w:tr>
+        <w:trPr>
+          <w:tblHeader w:val="on"/>
+        </w:trPr>
+        <w:tc>
+          <w:tcPr/>
+          <w:p>
+            <w:pPr>
+              <w:pStyle w:val="Compact"/>
+              <w:jc w:val="left"/>
+            </w:pPr>
+            <w:r>
+              <w:t xml:space="preserve">Candidate</w:t>
+            </w:r>
+          </w:p>
+        </w:tc>
+        <w:tc>
+          <w:tcPr/>
+          <w:p>
+            <w:pPr>
+              <w:pStyle w:val="Compact"/>
+              <w:jc w:val="right"/>
+            </w:pPr>
+            <w:r>
+              <w:t xml:space="preserve">Represented CAD material [kg]</w:t>
+            </w:r>
+          </w:p>
+        </w:tc>
+        <w:tc>
+          <w:tcPr/>
+          <w:p>
+            <w:pPr>
+              <w:pStyle w:val="Compact"/>
+              <w:jc w:val="right"/>
+            </w:pPr>
+            <w:r>
+              <w:t xml:space="preserve">Listed catalog options [kg]</w:t>
+            </w:r>
+          </w:p>
+        </w:tc>
+        <w:tc>
+          <w:tcPr/>
+          <w:p>
+            <w:pPr>
+              <w:pStyle w:val="Compact"/>
+              <w:jc w:val="left"/>
+            </w:pPr>
+            <w:r>
+              <w:t xml:space="preserve">Mandatory eligibility</w:t>
+            </w:r>
+          </w:p>
+        </w:tc>
+      </w:tr>
+      <w:tr>
+        <w:tc>
+          <w:tcPr/>
+          <w:p>
+            <w:pPr>
+              <w:pStyle w:val="Compact"/>
+              <w:jc w:val="left"/>
+            </w:pPr>
+            <w:r>
+              <w:t xml:space="preserve">Captive lead screw</w:t>
+            </w:r>
+          </w:p>
+        </w:tc>
+        <w:tc>
+          <w:tcPr/>
+          <w:p>
+            <w:pPr>
+              <w:pStyle w:val="Compact"/>
+              <w:jc w:val="right"/>
+            </w:pPr>
+            <w:r>
+              <w:t xml:space="preserve">18.606</w:t>
+            </w:r>
+          </w:p>
+        </w:tc>
+        <w:tc>
+          <w:tcPr/>
+          <w:p>
+            <w:pPr>
+              <w:pStyle w:val="Compact"/>
+              <w:jc w:val="right"/>
+            </w:pPr>
+            <w:r>
+              <w:t xml:space="preserve">4.230</w:t>
+            </w:r>
+          </w:p>
+        </w:tc>
+        <w:tc>
+          <w:tcPr/>
+          <w:p>
+            <w:pPr>
+              <w:pStyle w:val="Compact"/>
+              <w:jc w:val="left"/>
+            </w:pPr>
+            <w:r>
+              <w:t xml:space="preserve">Not eligible</w:t>
+            </w:r>
+          </w:p>
+        </w:tc>
+      </w:tr>
+      <w:tr>
+        <w:tc>
+          <w:tcPr/>
+          <w:p>
+            <w:pPr>
+              <w:pStyle w:val="Compact"/>
+              <w:jc w:val="left"/>
+            </w:pPr>
+            <w:r>
+              <w:t xml:space="preserve">Spring / dual gate</w:t>
+            </w:r>
+          </w:p>
+        </w:tc>
+        <w:tc>
+          <w:tcPr/>
+          <w:p>
+            <w:pPr>
+              <w:pStyle w:val="Compact"/>
+              <w:jc w:val="right"/>
+            </w:pPr>
+            <w:r>
+              <w:t xml:space="preserve">18.915</w:t>
+            </w:r>
+          </w:p>
+        </w:tc>
+        <w:tc>
+          <w:tcPr/>
+          <w:p>
+            <w:pPr>
+              <w:pStyle w:val="Compact"/>
+              <w:jc w:val="right"/>
+            </w:pPr>
+            <w:r>
+              <w:t xml:space="preserve">6.002</w:t>
+            </w:r>
+          </w:p>
+        </w:tc>
+        <w:tc>
+          <w:tcPr/>
+          <w:p>
+            <w:pPr>
+              <w:pStyle w:val="Compact"/>
+              <w:jc w:val="left"/>
+            </w:pPr>
+            <w:r>
+              <w:t xml:space="preserve">Not eligible</w:t>
+            </w:r>
+          </w:p>
+        </w:tc>
+      </w:tr>
+      <w:tr>
+        <w:tc>
+          <w:tcPr/>
+          <w:p>
+            <w:pPr>
+              <w:pStyle w:val="Compact"/>
+              <w:jc w:val="left"/>
+            </w:pPr>
+            <w:r>
+              <w:t xml:space="preserve">Rack / pawl</w:t>
+            </w:r>
+          </w:p>
+        </w:tc>
+        <w:tc>
+          <w:tcPr/>
+          <w:p>
+            <w:pPr>
+              <w:pStyle w:val="Compact"/>
+              <w:jc w:val="right"/>
+            </w:pPr>
+            <w:r>
+              <w:t xml:space="preserve">18.618</w:t>
+            </w:r>
+          </w:p>
+        </w:tc>
+        <w:tc>
+          <w:tcPr/>
+          <w:p>
+            <w:pPr>
+              <w:pStyle w:val="Compact"/>
+              <w:jc w:val="right"/>
+            </w:pPr>
+            <w:r>
+              <w:t xml:space="preserve">5.830</w:t>
+            </w:r>
+          </w:p>
+        </w:tc>
+        <w:tc>
+          <w:tcPr/>
+          <w:p>
+            <w:pPr>
+              <w:pStyle w:val="Compact"/>
+              <w:jc w:val="left"/>
+            </w:pPr>
+            <w:r>
+              <w:t xml:space="preserve">Not eligible</w:t>
+            </w:r>
+          </w:p>
+        </w:tc>
+      </w:tr>
+      <w:tr>
+        <w:tc>
+          <w:tcPr/>
+          <w:p>
+            <w:pPr>
+              <w:pStyle w:val="Compact"/>
+              <w:jc w:val="left"/>
+            </w:pPr>
+            <w:r>
+              <w:t xml:space="preserve">Indexed drum</w:t>
+            </w:r>
+          </w:p>
+        </w:tc>
+        <w:tc>
+          <w:tcPr/>
+          <w:p>
+            <w:pPr>
+              <w:pStyle w:val="Compact"/>
+              <w:jc w:val="right"/>
+            </w:pPr>
+            <w:r>
+              <w:t xml:space="preserve">14.821</w:t>
+            </w:r>
+          </w:p>
+        </w:tc>
+        <w:tc>
+          <w:tcPr/>
+          <w:p>
+            <w:pPr>
+              <w:pStyle w:val="Compact"/>
+              <w:jc w:val="right"/>
+            </w:pPr>
+            <w:r>
+              <w:t xml:space="preserve">1.932</w:t>
+            </w:r>
+          </w:p>
+        </w:tc>
+        <w:tc>
+          <w:tcPr/>
+          <w:p>
+            <w:pPr>
+              <w:pStyle w:val="Compact"/>
+              <w:jc w:val="left"/>
+            </w:pPr>
+            <w:r>
+              <w:t xml:space="preserve">Not eligible</w:t>
+            </w:r>
+          </w:p>
+        </w:tc>
+      </w:tr>
+      <w:tr>
+        <w:tc>
+          <w:tcPr/>
+          <w:p>
+            <w:pPr>
+              <w:pStyle w:val="Compact"/>
+              <w:jc w:val="left"/>
+            </w:pPr>
+            <w:r>
+              <w:t xml:space="preserve">Pantograph</w:t>
+            </w:r>
+          </w:p>
+        </w:tc>
+        <w:tc>
+          <w:tcPr/>
+          <w:p>
+            <w:pPr>
+              <w:pStyle w:val="Compact"/>
+              <w:jc w:val="right"/>
+            </w:pPr>
+            <w:r>
+              <w:t xml:space="preserve">18.060</w:t>
+            </w:r>
+          </w:p>
+        </w:tc>
+        <w:tc>
+          <w:tcPr/>
+          <w:p>
+            <w:pPr>
+              <w:pStyle w:val="Compact"/>
+              <w:jc w:val="right"/>
+            </w:pPr>
+            <w:r>
+              <w:t xml:space="preserve">6.002</w:t>
+            </w:r>
+          </w:p>
+        </w:tc>
+        <w:tc>
+          <w:tcPr/>
+          <w:p>
+            <w:pPr>
+              <w:pStyle w:val="Compact"/>
+              <w:jc w:val="left"/>
+            </w:pPr>
+            <w:r>
+              <w:t xml:space="preserve">Not eligible</w:t>
+            </w:r>
+          </w:p>
+        </w:tc>
+      </w:tr>
+      <w:tr>
+        <w:tc>
+          <w:tcPr/>
+          <w:p>
+            <w:pPr>
+              <w:pStyle w:val="Compact"/>
+              <w:jc w:val="left"/>
+            </w:pPr>
+            <w:r>
+              <w:t xml:space="preserve">Nested telescope</w:t>
+            </w:r>
+          </w:p>
+        </w:tc>
+        <w:tc>
+          <w:tcPr/>
+          <w:p>
+            <w:pPr>
+              <w:pStyle w:val="Compact"/>
+              <w:jc w:val="right"/>
+            </w:pPr>
+            <w:r>
+              <w:t xml:space="preserve">18.132</w:t>
+            </w:r>
+          </w:p>
+        </w:tc>
+        <w:tc>
+          <w:tcPr/>
+          <w:p>
+            <w:pPr>
+              <w:pStyle w:val="Compact"/>
+              <w:jc w:val="right"/>
+            </w:pPr>
+            <w:r>
+              <w:t xml:space="preserve">4.230</w:t>
+            </w:r>
+          </w:p>
+        </w:tc>
+        <w:tc>
+          <w:tcPr/>
+          <w:p>
+            <w:pPr>
+              <w:pStyle w:val="Compact"/>
+              <w:jc w:val="left"/>
+            </w:pPr>
+            <w:r>
+              <w:t xml:space="preserve">Not eligible</w:t>
+            </w:r>
+          </w:p>
+        </w:tc>
+      </w:tr>
+      <w:tr>
+        <w:tc>
+          <w:tcPr/>
+          <w:p>
+            <w:pPr>
+              <w:pStyle w:val="Compact"/>
+              <w:jc w:val="left"/>
+            </w:pPr>
+            <w:r>
+              <w:t xml:space="preserve">Belt shuttle</w:t>
+            </w:r>
+          </w:p>
+        </w:tc>
+        <w:tc>
+          <w:tcPr/>
+          <w:p>
+            <w:pPr>
+              <w:pStyle w:val="Compact"/>
+              <w:jc w:val="right"/>
+            </w:pPr>
+            <w:r>
+              <w:t xml:space="preserve">17.915</w:t>
+            </w:r>
+          </w:p>
+        </w:tc>
+        <w:tc>
+          <w:tcPr/>
+          <w:p>
+            <w:pPr>
+              <w:pStyle w:val="Compact"/>
+              <w:jc w:val="right"/>
+            </w:pPr>
+            <w:r>
+              <w:t xml:space="preserve">5.830</w:t>
+            </w:r>
+          </w:p>
+        </w:tc>
+        <w:tc>
+          <w:tcPr/>
+          <w:p>
+            <w:pPr>
+              <w:pStyle w:val="Compact"/>
+              <w:jc w:val="left"/>
+            </w:pPr>
+            <w:r>
+              <w:t xml:space="preserve">Not eligible</w:t>
+            </w:r>
+          </w:p>
+        </w:tc>
+      </w:tr>
+    </w:tbl>
+    <w:p>
+      <w:pPr>
+        <w:pStyle w:val="BodyText"/>
+      </w:pPr>
+      <w:r>
+        <w:t xml:space="preserve">The source-backed option screen contains 384 time/station evaluations using manufacturer motor/gear/controller data. Listed cycle times remain conditional actuator options, not verified complete feed cycles. Spring force deficiency, a 35.5 mm pantograph output gap, telescopic component intersections and common-path interferences remain in the source records. Mandatory eligibility is evaluated before weighted ranking; none of the seven candidates is eligible, so no defensible numerical winner or controlled feeder freeze follows.</w:t>
+      </w:r>
+    </w:p>
+    <w:p>
+      <w:pPr>
+        <w:pStyle w:val="BodyText"/>
+      </w:pPr>
+      <w:r>
+        <w:t xml:space="preserve">The separate lead R2 correction trims obstructing guides/capture racks, shortens the screw blank, shifts its end bearing and relieves a guide-bearing housing. The checked nominal rectangular payload sweep changes from eight intersections to zero; the identified 16.176779 mm³ housing interference becomes zero. The corrected custom-material subtotal is 18.492547 kg. A 0.25 mm radial screw-bearing gap remains; positive bearing support, full-carriage clearance, loaded/tolerance/fault behavior, insert lock/return custody and full installed accounting are not accepted. R2 is separate from the seven R1 comparisons and from FM07-R6.</w:t>
+      </w:r>
+    </w:p>
+    <w:p>
+      <w:pPr>
+        <w:pStyle w:val="BodyText"/>
+      </w:pPr>
+      <w:r>
+        <w:t xml:space="preserve">Ten native/STEP pairs cover seven R1 candidates, corrected lead R2 and two insert coupons. A separate CadQuery/OpenCascade import checks all ten exchanges. For the eight full comparison assemblies, imported solid counts and volumes agree with the native records under the declared 1 ppm relative serialization-volume criterion. This is not a manufacturing tolerance or a different-kernel certification. The original spring serialization diagnostic and its sampled-surface evidence remain recorded.</w:t>
+      </w:r>
+    </w:p>
+    <w:p>
+      <w:pPr>
+        <w:pStyle w:val="CaptionedFigure"/>
+      </w:pPr>
+      <w:r>
+        <w:drawing>
+          <wp:inline>
+            <wp:extent cx="5389118" cy="2578678"/>
+            <wp:effectExtent b="0" l="0" r="0" t="0"/>
+            <wp:docPr descr="CAD material subtotals and separately listed catalog hardware options for the same four-payload boundary. Neither is a full installed-system mass; all candidates retain unpassed mandatory gates. Source: FDR09-R1." title="" id="244" name="Picture"/>
+            <a:graphic>
+              <a:graphicData uri="http://schemas.openxmlformats.org/drawingml/2006/picture">
+                <pic:pic>
+                  <pic:nvPicPr>
+                    <pic:cNvPr descr="../validation/feeder_common_boundary/comparison_mass.png" id="245" name="Picture"/>
+                    <pic:cNvPicPr>
+                      <a:picLocks noChangeArrowheads="1" noChangeAspect="1"/>
+                    </pic:cNvPicPr>
+                  </pic:nvPicPr>
+                  <pic:blipFill>
+                    <a:blip r:embed="rId243"/>
+                    <a:stretch>
+                      <a:fillRect/>
+                    </a:stretch>
+                  </pic:blipFill>
+                  <pic:spPr bwMode="auto">
+                    <a:xfrm>
+                      <a:off x="0" y="0"/>
+                      <a:ext cx="5389118" cy="2578678"/>
+                    </a:xfrm>
+                    <a:prstGeom prst="rect">
+                      <a:avLst/>
+                    </a:prstGeom>
+                    <a:noFill/>
+                    <a:ln w="9525">
+                      <a:noFill/>
+                      <a:headEnd/>
+                      <a:tailEnd/>
+                    </a:ln>
+                  </pic:spPr>
+                </pic:pic>
+              </a:graphicData>
+            </a:graphic>
+          </wp:inline>
+        </w:drawing>
+      </w:r>
+    </w:p>
+    <w:p>
+      <w:pPr>
+        <w:pStyle w:val="Caption"/>
+      </w:pPr>
+      <w:r>
+        <w:t xml:space="preserve">Figure </w:t>
+      </w:r>
+      <w:fldSimple w:instr="SEQ Figure \* ARABIC">
+        <w:r>
+          <w:t>37</w:t>
+        </w:r>
+      </w:fldSimple>
+      <w:r>
+        <w:t>: CAD material subtotals and separately listed catalog hardware options for the same four-payload boundary. Neither is a full installed-system mass; all candidates retain unpassed mandatory gates. Source: FDR09-R1.</w:t>
+      </w:r>
+    </w:p>
+    <w:bookmarkEnd w:id="246"/>
+    <w:bookmarkEnd w:id="247"/>
+    <w:bookmarkStart w:id="252" w:name="bibliography"/>
     <w:p>
       <w:pPr>
         <w:pStyle w:val="Heading1"/>
@@ -11356,7 +12575,7 @@
       <w:r>
         <w:t xml:space="preserve"> </w:t>
       </w:r>
-      <w:hyperlink r:id="rId226">
+      <w:hyperlink r:id="rId248">
         <w:r>
           <w:rPr>
             <w:rStyle w:val="Hyperlink"/>
@@ -11507,7 +12726,7 @@
       <w:r>
         <w:t xml:space="preserve"> </w:t>
       </w:r>
-      <w:hyperlink r:id="rId227">
+      <w:hyperlink r:id="rId249">
         <w:r>
           <w:rPr>
             <w:rStyle w:val="Hyperlink"/>
@@ -11571,7 +12790,7 @@
       <w:r>
         <w:t xml:space="preserve"> </w:t>
       </w:r>
-      <w:hyperlink r:id="rId228">
+      <w:hyperlink r:id="rId250">
         <w:r>
           <w:rPr>
             <w:rStyle w:val="Hyperlink"/>
@@ -11771,7 +12990,7 @@
       <w:r>
         <w:t xml:space="preserve"> </w:t>
       </w:r>
-      <w:hyperlink r:id="rId229">
+      <w:hyperlink r:id="rId251">
         <w:r>
           <w:rPr>
             <w:rStyle w:val="Hyperlink"/>
@@ -11783,7 +13002,7 @@
         <w:t xml:space="preserve">. Bibliographic context; not an experimental validation of VOLLEY.</w:t>
       </w:r>
     </w:p>
-    <w:bookmarkEnd w:id="230"/>
+    <w:bookmarkEnd w:id="252"/>
     <w:sectPr>
       <w:footerReference r:id="rId9" w:type="default"/>
       <w:pgSz w:h="16838" w:w="11906"/>

</xml_diff>